<commit_message>
Ajuste en el formato de oficio
</commit_message>
<xml_diff>
--- a/backend/templates/Plantilla Oficio Solicitud Transparencia.docx
+++ b/backend/templates/Plantilla Oficio Solicitud Transparencia.docx
@@ -1,6 +1,6 @@
 
 <file path=word/document.xml><?xml version="1.0" encoding="utf-8"?>
-<w:document xmlns:wpc="http://schemas.microsoft.com/office/word/2010/wordprocessingCanvas" xmlns:cx="http://schemas.microsoft.com/office/drawing/2014/chartex" xmlns:cx1="http://schemas.microsoft.com/office/drawing/2015/9/8/chartex" xmlns:cx2="http://schemas.microsoft.com/office/drawing/2015/10/21/chartex" xmlns:cx3="http://schemas.microsoft.com/office/drawing/2016/5/9/chartex" xmlns:cx4="http://schemas.microsoft.com/office/drawing/2016/5/10/chartex" xmlns:cx5="http://schemas.microsoft.com/office/drawing/2016/5/11/chartex" xmlns:cx6="http://schemas.microsoft.com/office/drawing/2016/5/12/chartex" xmlns:cx7="http://schemas.microsoft.com/office/drawing/2016/5/13/chartex" xmlns:cx8="http://schemas.microsoft.com/office/drawing/2016/5/14/chartex" xmlns:mc="http://schemas.openxmlformats.org/markup-compatibility/2006" xmlns:aink="http://schemas.microsoft.com/office/drawing/2016/ink" xmlns:am3d="http://schemas.microsoft.com/office/drawing/2017/model3d" xmlns:o="urn:schemas-microsoft-com:office:office" xmlns:oel="http://schemas.microsoft.com/office/2019/extlst" xmlns:r="http://schemas.openxmlformats.org/officeDocument/2006/relationships" xmlns:m="http://schemas.openxmlformats.org/officeDocument/2006/math" xmlns:v="urn:schemas-microsoft-com:vml" xmlns:wp14="http://schemas.microsoft.com/office/word/2010/wordprocessingDrawing" xmlns:wp="http://schemas.openxmlformats.org/drawingml/2006/wordprocessingDrawing" xmlns:w10="urn:schemas-microsoft-com:office:word" xmlns:w="http://schemas.openxmlformats.org/wordprocessingml/2006/main" xmlns:w14="http://schemas.microsoft.com/office/word/2010/wordml" xmlns:w15="http://schemas.microsoft.com/office/word/2012/wordml" xmlns:w16cex="http://schemas.microsoft.com/office/word/2018/wordml/cex" xmlns:w16cid="http://schemas.microsoft.com/office/word/2016/wordml/cid" xmlns:w16="http://schemas.microsoft.com/office/word/2018/wordml" xmlns:w16du="http://schemas.microsoft.com/office/word/2023/wordml/word16du" xmlns:w16sdtdh="http://schemas.microsoft.com/office/word/2020/wordml/sdtdatahash" xmlns:w16sdtfl="http://schemas.microsoft.com/office/word/2024/wordml/sdtformatlock" xmlns:w16se="http://schemas.microsoft.com/office/word/2015/wordml/symex" xmlns:wpg="http://schemas.microsoft.com/office/word/2010/wordprocessingGroup" xmlns:wpi="http://schemas.microsoft.com/office/word/2010/wordprocessingInk" xmlns:wne="http://schemas.microsoft.com/office/word/2006/wordml" xmlns:wps="http://schemas.microsoft.com/office/word/2010/wordprocessingShape" mc:Ignorable="w14 w15 w16se w16cid w16 w16cex w16sdtdh w16sdtfl w16du wp14">
+<w:document xmlns:wpc="http://schemas.microsoft.com/office/word/2010/wordprocessingCanvas" xmlns:cx="http://schemas.microsoft.com/office/drawing/2014/chartex" xmlns:cx1="http://schemas.microsoft.com/office/drawing/2015/9/8/chartex" xmlns:cx2="http://schemas.microsoft.com/office/drawing/2015/10/21/chartex" xmlns:cx3="http://schemas.microsoft.com/office/drawing/2016/5/9/chartex" xmlns:cx4="http://schemas.microsoft.com/office/drawing/2016/5/10/chartex" xmlns:cx5="http://schemas.microsoft.com/office/drawing/2016/5/11/chartex" xmlns:cx6="http://schemas.microsoft.com/office/drawing/2016/5/12/chartex" xmlns:cx7="http://schemas.microsoft.com/office/drawing/2016/5/13/chartex" xmlns:cx8="http://schemas.microsoft.com/office/drawing/2016/5/14/chartex" xmlns:mc="http://schemas.openxmlformats.org/markup-compatibility/2006" xmlns:aink="http://schemas.microsoft.com/office/drawing/2016/ink" xmlns:am3d="http://schemas.microsoft.com/office/drawing/2017/model3d" xmlns:o="urn:schemas-microsoft-com:office:office" xmlns:r="http://schemas.openxmlformats.org/officeDocument/2006/relationships" xmlns:m="http://schemas.openxmlformats.org/officeDocument/2006/math" xmlns:v="urn:schemas-microsoft-com:vml" xmlns:wp14="http://schemas.microsoft.com/office/word/2010/wordprocessingDrawing" xmlns:wp="http://schemas.openxmlformats.org/drawingml/2006/wordprocessingDrawing" xmlns:w10="urn:schemas-microsoft-com:office:word" xmlns:w="http://schemas.openxmlformats.org/wordprocessingml/2006/main" xmlns:w14="http://schemas.microsoft.com/office/word/2010/wordml" xmlns:w15="http://schemas.microsoft.com/office/word/2012/wordml" xmlns:w16cex="http://schemas.microsoft.com/office/word/2018/wordml/cex" xmlns:w16cid="http://schemas.microsoft.com/office/word/2016/wordml/cid" xmlns:w16="http://schemas.microsoft.com/office/word/2018/wordml" xmlns:w16sdtdh="http://schemas.microsoft.com/office/word/2020/wordml/sdtdatahash" xmlns:w16se="http://schemas.microsoft.com/office/word/2015/wordml/symex" xmlns:wpg="http://schemas.microsoft.com/office/word/2010/wordprocessingGroup" xmlns:wpi="http://schemas.microsoft.com/office/word/2010/wordprocessingInk" xmlns:wne="http://schemas.microsoft.com/office/word/2006/wordml" xmlns:wps="http://schemas.microsoft.com/office/word/2010/wordprocessingShape" mc:Ignorable="w14 w15 w16se w16cid w16 w16cex w16sdtdh wp14">
   <w:body>
     <w:p>
       <w:pPr>
@@ -40,6 +40,7 @@
       <w:proofErr w:type="spellStart"/>
       <w:r>
         <w:rPr>
+          <w:rFonts w:ascii="Gill Sans MT" w:hAnsi="Gill Sans MT"/>
           <w:b/>
           <w:bCs/>
         </w:rPr>
@@ -48,10 +49,17 @@
       <w:proofErr w:type="spellEnd"/>
       <w:r>
         <w:rPr>
+          <w:rFonts w:ascii="Gill Sans MT" w:hAnsi="Gill Sans MT"/>
           <w:b/>
           <w:bCs/>
         </w:rPr>
-        <w:t>. Núm.: CG {folio}</w:t>
+        <w:t xml:space="preserve">. Núm.: </w:t>
+      </w:r>
+      <w:r>
+        <w:rPr>
+          <w:rFonts w:ascii="Gill Sans MT" w:hAnsi="Gill Sans MT"/>
+        </w:rPr>
+        <w:t>CG {folio}</w:t>
       </w:r>
       <w:r>
         <w:rPr>
@@ -59,10 +67,29 @@
           <w:szCs w:val="18"/>
         </w:rPr>
         <w:br/>
-        <w:t xml:space="preserve"> Asunto: Solicitud de acceso a la</w:t>
+        <w:t xml:space="preserve"> </w:t>
       </w:r>
       <w:r>
         <w:rPr>
+          <w:rFonts w:ascii="Gill Sans MT" w:hAnsi="Gill Sans MT"/>
+          <w:b/>
+          <w:bCs/>
+          <w:sz w:val="18"/>
+          <w:szCs w:val="18"/>
+        </w:rPr>
+        <w:t>Asunto:</w:t>
+      </w:r>
+      <w:r>
+        <w:rPr>
+          <w:rFonts w:ascii="Gill Sans MT" w:hAnsi="Gill Sans MT"/>
+          <w:sz w:val="18"/>
+          <w:szCs w:val="18"/>
+        </w:rPr>
+        <w:t xml:space="preserve"> Solicitud de acceso a la</w:t>
+      </w:r>
+      <w:r>
+        <w:rPr>
+          <w:rFonts w:ascii="Gill Sans MT" w:hAnsi="Gill Sans MT"/>
           <w:sz w:val="18"/>
           <w:szCs w:val="18"/>
         </w:rPr>
@@ -77,15 +104,8 @@
     </w:p>
     <w:tbl>
       <w:tblPr>
-        <w:tblW w:w="4045" w:type="pct"/>
-        <w:tblBorders>
-          <w:top w:val="none" w:sz="0" w:space="0" w:color="FFFFFF"/>
-          <w:left w:val="none" w:sz="0" w:space="0" w:color="FFFFFF"/>
-          <w:bottom w:val="none" w:sz="0" w:space="0" w:color="FFFFFF"/>
-          <w:right w:val="none" w:sz="0" w:space="0" w:color="FFFFFF"/>
-          <w:insideH w:val="none" w:sz="0" w:space="0" w:color="FFFFFF"/>
-          <w:insideV w:val="none" w:sz="0" w:space="0" w:color="FFFFFF"/>
-        </w:tblBorders>
+        <w:tblW w:w="5295" w:type="pct"/>
+        <w:tblInd w:w="-709" w:type="dxa"/>
         <w:tblCellMar>
           <w:left w:w="10" w:type="dxa"/>
           <w:right w:w="10" w:type="dxa"/>
@@ -93,19 +113,13 @@
         <w:tblLook w:val="04A0" w:firstRow="1" w:lastRow="0" w:firstColumn="1" w:lastColumn="0" w:noHBand="0" w:noVBand="1"/>
       </w:tblPr>
       <w:tblGrid>
-        <w:gridCol w:w="1842"/>
-        <w:gridCol w:w="5955"/>
+        <w:gridCol w:w="1984"/>
+        <w:gridCol w:w="8223"/>
       </w:tblGrid>
       <w:tr>
-        <w:tblPrEx>
-          <w:tblCellMar>
-            <w:top w:w="0" w:type="dxa"/>
-            <w:bottom w:w="0" w:type="dxa"/>
-          </w:tblCellMar>
-        </w:tblPrEx>
         <w:tc>
           <w:tcPr>
-            <w:tcW w:w="1181" w:type="pct"/>
+            <w:tcW w:w="972" w:type="pct"/>
             <w:tcMar>
               <w:top w:w="0" w:type="dxa"/>
               <w:left w:w="0" w:type="dxa"/>
@@ -114,115 +128,308 @@
             </w:tcMar>
           </w:tcPr>
           <w:p>
-            <w:r>
-              <w:rPr>
+            <w:pPr>
+              <w:jc w:val="center"/>
+              <w:rPr>
+                <w:rFonts w:ascii="Gill Sans MT" w:hAnsi="Gill Sans MT"/>
                 <w:b/>
-                <w:bCs/>
                 <w:sz w:val="16"/>
                 <w:szCs w:val="16"/>
               </w:rPr>
-              <w:t xml:space="preserve">Contraloría </w:t>
-            </w:r>
-            <w:proofErr w:type="gramStart"/>
-            <w:r>
-              <w:rPr>
+            </w:pPr>
+            <w:r>
+              <w:rPr>
+                <w:rFonts w:ascii="Gill Sans MT" w:hAnsi="Gill Sans MT"/>
                 <w:b/>
-                <w:bCs/>
                 <w:sz w:val="16"/>
                 <w:szCs w:val="16"/>
               </w:rPr>
-              <w:t xml:space="preserve">General </w:t>
-            </w:r>
-            <w:r>
-              <w:rPr>
-                <w:sz w:val="14"/>
-                <w:szCs w:val="14"/>
-              </w:rPr>
-              <w:t xml:space="preserve"> Murillo</w:t>
-            </w:r>
-            <w:proofErr w:type="gramEnd"/>
-            <w:r>
-              <w:rPr>
-                <w:sz w:val="14"/>
-                <w:szCs w:val="14"/>
-              </w:rPr>
-              <w:t xml:space="preserve"> Vidal Núm. 250 Col. Cuauhtémoc C.P. 91069 Xalapa, Ver. </w:t>
-            </w:r>
-            <w:proofErr w:type="gramStart"/>
-            <w:r>
-              <w:rPr>
-                <w:sz w:val="14"/>
-                <w:szCs w:val="14"/>
-              </w:rPr>
-              <w:t xml:space="preserve">México  </w:t>
-            </w:r>
-            <w:r>
-              <w:rPr>
+              <w:t>Contraloría General</w:t>
+            </w:r>
+          </w:p>
+          <w:p>
+            <w:pPr>
+              <w:jc w:val="right"/>
+              <w:rPr>
+                <w:rFonts w:ascii="Gill Sans MT" w:hAnsi="Gill Sans MT"/>
+                <w:sz w:val="18"/>
+                <w:szCs w:val="12"/>
+              </w:rPr>
+            </w:pPr>
+          </w:p>
+          <w:p>
+            <w:pPr>
+              <w:jc w:val="right"/>
+              <w:rPr>
+                <w:rFonts w:ascii="Gill Sans MT" w:hAnsi="Gill Sans MT"/>
+                <w:sz w:val="16"/>
+                <w:szCs w:val="14"/>
+              </w:rPr>
+            </w:pPr>
+            <w:r>
+              <w:rPr>
+                <w:rFonts w:ascii="Gill Sans MT" w:hAnsi="Gill Sans MT"/>
+                <w:sz w:val="16"/>
+                <w:szCs w:val="14"/>
+              </w:rPr>
+              <w:t>Murillo Vidal Núm. 250</w:t>
+            </w:r>
+          </w:p>
+          <w:p>
+            <w:pPr>
+              <w:jc w:val="right"/>
+              <w:rPr>
+                <w:rFonts w:ascii="Gill Sans MT" w:hAnsi="Gill Sans MT"/>
+                <w:sz w:val="16"/>
+                <w:szCs w:val="14"/>
+              </w:rPr>
+            </w:pPr>
+            <w:r>
+              <w:rPr>
+                <w:rFonts w:ascii="Gill Sans MT" w:hAnsi="Gill Sans MT"/>
+                <w:sz w:val="16"/>
+                <w:szCs w:val="14"/>
+              </w:rPr>
+              <w:t>Col. Cuauhtémoc</w:t>
+            </w:r>
+          </w:p>
+          <w:p>
+            <w:pPr>
+              <w:jc w:val="right"/>
+              <w:rPr>
+                <w:rFonts w:ascii="Gill Sans MT" w:hAnsi="Gill Sans MT"/>
+                <w:sz w:val="16"/>
+                <w:szCs w:val="14"/>
+              </w:rPr>
+            </w:pPr>
+            <w:r>
+              <w:rPr>
+                <w:rFonts w:ascii="Gill Sans MT" w:hAnsi="Gill Sans MT"/>
+                <w:sz w:val="16"/>
+                <w:szCs w:val="14"/>
+              </w:rPr>
+              <w:t>{</w:t>
+            </w:r>
+            <w:proofErr w:type="spellStart"/>
+            <w:r>
+              <w:rPr>
+                <w:rFonts w:ascii="Gill Sans MT" w:hAnsi="Gill Sans MT"/>
+                <w:sz w:val="16"/>
+                <w:szCs w:val="14"/>
+              </w:rPr>
+              <w:t>abreviacion</w:t>
+            </w:r>
+            <w:proofErr w:type="spellEnd"/>
+            <w:r>
+              <w:rPr>
+                <w:rFonts w:ascii="Gill Sans MT" w:hAnsi="Gill Sans MT"/>
+                <w:sz w:val="16"/>
+                <w:szCs w:val="14"/>
+              </w:rPr>
+              <w:t>} 91069</w:t>
+            </w:r>
+          </w:p>
+          <w:p>
+            <w:pPr>
+              <w:jc w:val="right"/>
+              <w:rPr>
+                <w:rFonts w:ascii="Gill Sans MT" w:hAnsi="Gill Sans MT"/>
+                <w:sz w:val="16"/>
+                <w:szCs w:val="14"/>
+              </w:rPr>
+            </w:pPr>
+            <w:r>
+              <w:rPr>
+                <w:rFonts w:ascii="Gill Sans MT" w:hAnsi="Gill Sans MT"/>
+                <w:sz w:val="16"/>
+                <w:szCs w:val="14"/>
+              </w:rPr>
+              <w:t>Xalapa, Ver.</w:t>
+            </w:r>
+          </w:p>
+          <w:p>
+            <w:pPr>
+              <w:jc w:val="right"/>
+              <w:rPr>
+                <w:rFonts w:ascii="Gill Sans MT" w:hAnsi="Gill Sans MT"/>
+                <w:sz w:val="16"/>
+                <w:szCs w:val="14"/>
+              </w:rPr>
+            </w:pPr>
+            <w:r>
+              <w:rPr>
+                <w:rFonts w:ascii="Gill Sans MT" w:hAnsi="Gill Sans MT"/>
+                <w:sz w:val="16"/>
+                <w:szCs w:val="14"/>
+              </w:rPr>
+              <w:t>México</w:t>
+            </w:r>
+          </w:p>
+          <w:p>
+            <w:pPr>
+              <w:jc w:val="right"/>
+              <w:rPr>
+                <w:rFonts w:ascii="Gill Sans MT" w:hAnsi="Gill Sans MT"/>
+                <w:sz w:val="16"/>
+                <w:szCs w:val="14"/>
+              </w:rPr>
+            </w:pPr>
+          </w:p>
+          <w:p>
+            <w:pPr>
+              <w:jc w:val="right"/>
+              <w:rPr>
+                <w:rFonts w:ascii="Gill Sans MT" w:hAnsi="Gill Sans MT"/>
                 <w:b/>
-                <w:bCs/>
-                <w:sz w:val="14"/>
+                <w:sz w:val="16"/>
+                <w:szCs w:val="14"/>
+              </w:rPr>
+            </w:pPr>
+            <w:r>
+              <w:rPr>
+                <w:rFonts w:ascii="Gill Sans MT" w:hAnsi="Gill Sans MT"/>
+                <w:b/>
+                <w:sz w:val="16"/>
                 <w:szCs w:val="14"/>
               </w:rPr>
               <w:t>Teléfonos</w:t>
             </w:r>
-            <w:proofErr w:type="gramEnd"/>
-            <w:r>
-              <w:rPr>
+          </w:p>
+          <w:p>
+            <w:pPr>
+              <w:jc w:val="right"/>
+              <w:rPr>
+                <w:rFonts w:ascii="Gill Sans MT" w:hAnsi="Gill Sans MT"/>
+                <w:sz w:val="16"/>
+                <w:szCs w:val="14"/>
+              </w:rPr>
+            </w:pPr>
+            <w:r>
+              <w:rPr>
+                <w:rFonts w:ascii="Gill Sans MT" w:hAnsi="Gill Sans MT"/>
+                <w:sz w:val="16"/>
+                <w:szCs w:val="14"/>
+              </w:rPr>
+              <w:t>01 228 814 28 91</w:t>
+            </w:r>
+          </w:p>
+          <w:p>
+            <w:pPr>
+              <w:jc w:val="right"/>
+              <w:rPr>
+                <w:rFonts w:ascii="Gill Sans MT" w:hAnsi="Gill Sans MT"/>
+                <w:sz w:val="16"/>
+                <w:szCs w:val="14"/>
+              </w:rPr>
+            </w:pPr>
+            <w:r>
+              <w:rPr>
+                <w:rFonts w:ascii="Gill Sans MT" w:hAnsi="Gill Sans MT"/>
+                <w:sz w:val="16"/>
+                <w:szCs w:val="14"/>
+              </w:rPr>
+              <w:t>01 228 842 17 00</w:t>
+            </w:r>
+          </w:p>
+          <w:p>
+            <w:pPr>
+              <w:jc w:val="right"/>
+              <w:rPr>
+                <w:rFonts w:ascii="Gill Sans MT" w:hAnsi="Gill Sans MT"/>
+                <w:sz w:val="16"/>
+                <w:szCs w:val="14"/>
+              </w:rPr>
+            </w:pPr>
+            <w:r>
+              <w:rPr>
+                <w:rFonts w:ascii="Gill Sans MT" w:hAnsi="Gill Sans MT"/>
+                <w:sz w:val="16"/>
+                <w:szCs w:val="14"/>
+              </w:rPr>
+              <w:t>Ext. 11716</w:t>
+            </w:r>
+          </w:p>
+          <w:p>
+            <w:pPr>
+              <w:jc w:val="right"/>
+              <w:rPr>
+                <w:rFonts w:ascii="Gill Sans MT" w:hAnsi="Gill Sans MT"/>
+                <w:sz w:val="16"/>
+                <w:szCs w:val="14"/>
+              </w:rPr>
+            </w:pPr>
+          </w:p>
+          <w:p>
+            <w:pPr>
+              <w:jc w:val="right"/>
+              <w:rPr>
+                <w:rFonts w:ascii="Gill Sans MT" w:hAnsi="Gill Sans MT"/>
                 <w:b/>
-                <w:bCs/>
-                <w:sz w:val="14"/>
-                <w:szCs w:val="14"/>
-              </w:rPr>
-              <w:t xml:space="preserve"> </w:t>
-            </w:r>
-            <w:r>
-              <w:rPr>
-                <w:sz w:val="14"/>
-                <w:szCs w:val="14"/>
-              </w:rPr>
-              <w:t xml:space="preserve">01 228 814 28 91 01 228 842 17 00 Ext. </w:t>
-            </w:r>
-            <w:proofErr w:type="gramStart"/>
-            <w:r>
-              <w:rPr>
-                <w:sz w:val="14"/>
-                <w:szCs w:val="14"/>
-              </w:rPr>
-              <w:t xml:space="preserve">11716  </w:t>
-            </w:r>
-            <w:r>
-              <w:rPr>
+                <w:sz w:val="16"/>
+                <w:szCs w:val="14"/>
+              </w:rPr>
+            </w:pPr>
+            <w:r>
+              <w:rPr>
+                <w:rFonts w:ascii="Gill Sans MT" w:hAnsi="Gill Sans MT"/>
                 <w:b/>
-                <w:bCs/>
-                <w:sz w:val="14"/>
-                <w:szCs w:val="14"/>
-              </w:rPr>
-              <w:t>Correo</w:t>
-            </w:r>
-            <w:proofErr w:type="gramEnd"/>
-            <w:r>
-              <w:rPr>
-                <w:b/>
-                <w:bCs/>
-                <w:sz w:val="14"/>
-                <w:szCs w:val="14"/>
-              </w:rPr>
-              <w:t xml:space="preserve"> electrónico </w:t>
-            </w:r>
-            <w:proofErr w:type="gramStart"/>
-            <w:r>
-              <w:rPr>
-                <w:sz w:val="14"/>
-                <w:szCs w:val="14"/>
-              </w:rPr>
-              <w:t>contraloriagral@uv.mx  www.uv.mx/contraloria/</w:t>
-            </w:r>
-            <w:proofErr w:type="gramEnd"/>
-          </w:p>
+                <w:sz w:val="16"/>
+                <w:szCs w:val="14"/>
+              </w:rPr>
+              <w:t>Correo electrónico</w:t>
+            </w:r>
+          </w:p>
+          <w:p>
+            <w:pPr>
+              <w:jc w:val="right"/>
+              <w:rPr>
+                <w:rFonts w:ascii="Gill Sans MT" w:hAnsi="Gill Sans MT"/>
+                <w:sz w:val="16"/>
+                <w:szCs w:val="14"/>
+              </w:rPr>
+            </w:pPr>
+            <w:r>
+              <w:rPr>
+                <w:rFonts w:ascii="Gill Sans MT" w:hAnsi="Gill Sans MT"/>
+                <w:sz w:val="16"/>
+                <w:szCs w:val="14"/>
+              </w:rPr>
+              <w:t>contraloriagral@uv.mx</w:t>
+            </w:r>
+          </w:p>
+          <w:p>
+            <w:pPr>
+              <w:jc w:val="right"/>
+              <w:rPr>
+                <w:rFonts w:ascii="Gill Sans MT" w:hAnsi="Gill Sans MT"/>
+                <w:sz w:val="16"/>
+                <w:szCs w:val="14"/>
+              </w:rPr>
+            </w:pPr>
+          </w:p>
+          <w:p>
+            <w:pPr>
+              <w:jc w:val="right"/>
+              <w:rPr>
+                <w:rFonts w:ascii="Gill Sans MT" w:hAnsi="Gill Sans MT"/>
+                <w:sz w:val="16"/>
+                <w:szCs w:val="14"/>
+              </w:rPr>
+            </w:pPr>
+            <w:r>
+              <w:rPr>
+                <w:rFonts w:ascii="Gill Sans MT" w:hAnsi="Gill Sans MT"/>
+                <w:sz w:val="16"/>
+                <w:szCs w:val="14"/>
+              </w:rPr>
+              <w:t>www.uv.mx/contraloria/</w:t>
+            </w:r>
+          </w:p>
+          <w:p/>
         </w:tc>
         <w:tc>
           <w:tcPr>
-            <w:tcW w:w="3819" w:type="pct"/>
+            <w:tcW w:w="4028" w:type="pct"/>
             <w:tcMar>
               <w:top w:w="0" w:type="dxa"/>
               <w:left w:w="200" w:type="dxa"/>
@@ -233,142 +440,203 @@
           <w:p>
             <w:r>
               <w:rPr>
+                <w:rFonts w:ascii="Gill Sans MT" w:hAnsi="Gill Sans MT"/>
                 <w:b/>
                 <w:bCs/>
-                <w:sz w:val="22"/>
-                <w:szCs w:val="22"/>
+                <w:sz w:val="24"/>
+                <w:szCs w:val="24"/>
               </w:rPr>
               <w:t>{</w:t>
             </w:r>
             <w:proofErr w:type="spellStart"/>
             <w:r>
               <w:rPr>
+                <w:rFonts w:ascii="Gill Sans MT" w:hAnsi="Gill Sans MT"/>
                 <w:b/>
                 <w:bCs/>
-                <w:sz w:val="22"/>
-                <w:szCs w:val="22"/>
+                <w:sz w:val="24"/>
+                <w:szCs w:val="24"/>
               </w:rPr>
               <w:t>abreviacion</w:t>
             </w:r>
             <w:proofErr w:type="spellEnd"/>
             <w:r>
               <w:rPr>
+                <w:rFonts w:ascii="Gill Sans MT" w:hAnsi="Gill Sans MT"/>
                 <w:b/>
                 <w:bCs/>
-                <w:sz w:val="22"/>
-                <w:szCs w:val="22"/>
+                <w:sz w:val="24"/>
+                <w:szCs w:val="24"/>
               </w:rPr>
               <w:t>} {nombre} {</w:t>
             </w:r>
             <w:proofErr w:type="spellStart"/>
             <w:r>
               <w:rPr>
+                <w:rFonts w:ascii="Gill Sans MT" w:hAnsi="Gill Sans MT"/>
                 <w:b/>
                 <w:bCs/>
-                <w:sz w:val="22"/>
-                <w:szCs w:val="22"/>
+                <w:sz w:val="24"/>
+                <w:szCs w:val="24"/>
               </w:rPr>
               <w:t>apellidoPaterno</w:t>
             </w:r>
             <w:proofErr w:type="spellEnd"/>
             <w:r>
               <w:rPr>
+                <w:rFonts w:ascii="Gill Sans MT" w:hAnsi="Gill Sans MT"/>
                 <w:b/>
                 <w:bCs/>
-                <w:sz w:val="22"/>
-                <w:szCs w:val="22"/>
+                <w:sz w:val="24"/>
+                <w:szCs w:val="24"/>
               </w:rPr>
               <w:t>} {</w:t>
             </w:r>
             <w:proofErr w:type="spellStart"/>
             <w:r>
               <w:rPr>
+                <w:rFonts w:ascii="Gill Sans MT" w:hAnsi="Gill Sans MT"/>
                 <w:b/>
                 <w:bCs/>
-                <w:sz w:val="22"/>
-                <w:szCs w:val="22"/>
+                <w:sz w:val="24"/>
+                <w:szCs w:val="24"/>
               </w:rPr>
               <w:t>apellidoMaterno</w:t>
             </w:r>
             <w:proofErr w:type="spellEnd"/>
             <w:r>
               <w:rPr>
+                <w:rFonts w:ascii="Gill Sans MT" w:hAnsi="Gill Sans MT"/>
                 <w:b/>
                 <w:bCs/>
-                <w:sz w:val="22"/>
-                <w:szCs w:val="22"/>
+                <w:sz w:val="24"/>
+                <w:szCs w:val="24"/>
               </w:rPr>
               <w:t>}</w:t>
             </w:r>
             <w:r>
+              <w:rPr>
+                <w:rFonts w:ascii="Gill Sans MT" w:hAnsi="Gill Sans MT"/>
+                <w:sz w:val="24"/>
+                <w:szCs w:val="24"/>
+              </w:rPr>
               <w:br/>
               <w:t xml:space="preserve"> {puesto}</w:t>
             </w:r>
             <w:r>
               <w:br/>
-              <w:t xml:space="preserve"> Contraloría General de la Universidad Veracruzana</w:t>
+            </w:r>
+            <w:r>
+              <w:rPr>
+                <w:rFonts w:ascii="Gill Sans MT" w:hAnsi="Gill Sans MT"/>
+                <w:sz w:val="24"/>
+                <w:szCs w:val="24"/>
+              </w:rPr>
+              <w:t xml:space="preserve"> C</w:t>
+            </w:r>
+            <w:r>
+              <w:rPr>
+                <w:rFonts w:ascii="Gill Sans MT" w:hAnsi="Gill Sans MT"/>
+                <w:sz w:val="24"/>
+                <w:szCs w:val="24"/>
+              </w:rPr>
+              <w:t>ontraloría General de la Universidad Veracruzana</w:t>
             </w:r>
             <w:r>
               <w:br/>
-              <w:t xml:space="preserve"> P r e s e n t e.</w:t>
+              <w:t xml:space="preserve"> </w:t>
+            </w:r>
+            <w:r>
+              <w:rPr>
+                <w:rFonts w:ascii="Gill Sans MT" w:hAnsi="Gill Sans MT"/>
+                <w:sz w:val="24"/>
+                <w:szCs w:val="24"/>
+              </w:rPr>
+              <w:t>P r e s e n t e.</w:t>
             </w:r>
           </w:p>
           <w:p>
             <w:pPr>
               <w:spacing w:before="200" w:after="200"/>
-            </w:pPr>
-            <w:r>
-              <w:rPr>
+              <w:rPr>
+                <w:rFonts w:ascii="Gill Sans MT" w:hAnsi="Gill Sans MT"/>
+                <w:sz w:val="24"/>
+                <w:szCs w:val="24"/>
+              </w:rPr>
+            </w:pPr>
+            <w:r>
+              <w:rPr>
+                <w:rFonts w:ascii="Gill Sans MT" w:hAnsi="Gill Sans MT"/>
                 <w:i/>
                 <w:iCs/>
+                <w:sz w:val="24"/>
+                <w:szCs w:val="24"/>
               </w:rPr>
               <w:t>Apreciable {</w:t>
             </w:r>
             <w:proofErr w:type="spellStart"/>
             <w:r>
               <w:rPr>
+                <w:rFonts w:ascii="Gill Sans MT" w:hAnsi="Gill Sans MT"/>
                 <w:i/>
                 <w:iCs/>
+                <w:sz w:val="24"/>
+                <w:szCs w:val="24"/>
               </w:rPr>
               <w:t>ocupacion</w:t>
             </w:r>
             <w:proofErr w:type="spellEnd"/>
             <w:r>
               <w:rPr>
+                <w:rFonts w:ascii="Gill Sans MT" w:hAnsi="Gill Sans MT"/>
                 <w:i/>
                 <w:iCs/>
+                <w:sz w:val="24"/>
+                <w:szCs w:val="24"/>
               </w:rPr>
               <w:t>} {</w:t>
             </w:r>
             <w:proofErr w:type="spellStart"/>
             <w:r>
               <w:rPr>
+                <w:rFonts w:ascii="Gill Sans MT" w:hAnsi="Gill Sans MT"/>
                 <w:i/>
                 <w:iCs/>
+                <w:sz w:val="24"/>
+                <w:szCs w:val="24"/>
               </w:rPr>
               <w:t>apellidoPaterno</w:t>
             </w:r>
             <w:proofErr w:type="spellEnd"/>
             <w:r>
               <w:rPr>
+                <w:rFonts w:ascii="Gill Sans MT" w:hAnsi="Gill Sans MT"/>
                 <w:i/>
                 <w:iCs/>
+                <w:sz w:val="24"/>
+                <w:szCs w:val="24"/>
               </w:rPr>
               <w:t>} {</w:t>
             </w:r>
             <w:proofErr w:type="spellStart"/>
             <w:r>
               <w:rPr>
+                <w:rFonts w:ascii="Gill Sans MT" w:hAnsi="Gill Sans MT"/>
                 <w:i/>
                 <w:iCs/>
+                <w:sz w:val="24"/>
+                <w:szCs w:val="24"/>
               </w:rPr>
               <w:t>apellidoMaterno</w:t>
             </w:r>
             <w:proofErr w:type="spellEnd"/>
             <w:r>
               <w:rPr>
+                <w:rFonts w:ascii="Gill Sans MT" w:hAnsi="Gill Sans MT"/>
                 <w:i/>
                 <w:iCs/>
+                <w:sz w:val="24"/>
+                <w:szCs w:val="24"/>
               </w:rPr>
               <w:t>},</w:t>
             </w:r>
@@ -377,32 +645,116 @@
             <w:pPr>
               <w:spacing w:after="200"/>
               <w:jc w:val="both"/>
-            </w:pPr>
-            <w:r>
-              <w:t>Con fundamento en lo dispuesto por los artículos 34-B, y 34-C, fracción XI, de la Ley Orgánica de la Universidad Veracruzana; 4, fracción X, 14, 15, y 17, fracciones IV y XIV, 336, fracción XXIII, del Estatuto General de la Universidad Veracruzana; y en atención al “Acuerdo mediante el cual se instruye a las áreas de la Contraloría General para atender las solicitudes de acceso a la información, dentro del ámbito de su competencia”, de fecha {</w:t>
+              <w:rPr>
+                <w:rFonts w:ascii="Gill Sans MT" w:hAnsi="Gill Sans MT"/>
+                <w:sz w:val="24"/>
+                <w:szCs w:val="24"/>
+              </w:rPr>
+            </w:pPr>
+            <w:r>
+              <w:rPr>
+                <w:rFonts w:ascii="Gill Sans MT" w:hAnsi="Gill Sans MT"/>
+                <w:sz w:val="24"/>
+                <w:szCs w:val="24"/>
+              </w:rPr>
+              <w:t xml:space="preserve">Con fundamento en lo dispuesto por los artículos 34-B, y 34-C, fracción XI, de la Ley Orgánica de la Universidad Veracruzana; 4, </w:t>
+            </w:r>
+            <w:r>
+              <w:rPr>
+                <w:rFonts w:ascii="Gill Sans MT" w:hAnsi="Gill Sans MT"/>
+                <w:sz w:val="24"/>
+                <w:szCs w:val="24"/>
+              </w:rPr>
+              <w:t xml:space="preserve">fracción X, 14, 15, y 17, fracciones IV y XIV, 336, fracción XXIII, del Estatuto General de la Universidad Veracruzana; y en atención al </w:t>
+            </w:r>
+            <w:r>
+              <w:rPr>
+                <w:rFonts w:ascii="Gill Sans MT" w:hAnsi="Gill Sans MT"/>
+                <w:i/>
+                <w:iCs/>
+                <w:sz w:val="24"/>
+                <w:szCs w:val="24"/>
+              </w:rPr>
+              <w:t>“Acuerdo mediante el cual se instruye a las áreas de la Contraloría General para atender las solicitudes de acceso a la</w:t>
+            </w:r>
+            <w:r>
+              <w:rPr>
+                <w:rFonts w:ascii="Gill Sans MT" w:hAnsi="Gill Sans MT"/>
+                <w:i/>
+                <w:iCs/>
+                <w:sz w:val="24"/>
+                <w:szCs w:val="24"/>
+              </w:rPr>
+              <w:t xml:space="preserve"> información, dentro del ámbito de su competencia”</w:t>
+            </w:r>
+            <w:r>
+              <w:rPr>
+                <w:rFonts w:ascii="Gill Sans MT" w:hAnsi="Gill Sans MT"/>
+                <w:sz w:val="24"/>
+                <w:szCs w:val="24"/>
+              </w:rPr>
+              <w:t>, de fecha {</w:t>
             </w:r>
             <w:proofErr w:type="spellStart"/>
             <w:r>
+              <w:rPr>
+                <w:rFonts w:ascii="Gill Sans MT" w:hAnsi="Gill Sans MT"/>
+                <w:sz w:val="24"/>
+                <w:szCs w:val="24"/>
+              </w:rPr>
               <w:t>fechaReferencia</w:t>
             </w:r>
             <w:proofErr w:type="spellEnd"/>
             <w:r>
+              <w:rPr>
+                <w:rFonts w:ascii="Gill Sans MT" w:hAnsi="Gill Sans MT"/>
+                <w:sz w:val="24"/>
+                <w:szCs w:val="24"/>
+              </w:rPr>
               <w:t>}, me permito remitir a usted la solicitud de información recibida el {</w:t>
             </w:r>
             <w:proofErr w:type="spellStart"/>
             <w:r>
+              <w:rPr>
+                <w:rFonts w:ascii="Gill Sans MT" w:hAnsi="Gill Sans MT"/>
+                <w:sz w:val="24"/>
+                <w:szCs w:val="24"/>
+              </w:rPr>
               <w:t>fechaHoyLong</w:t>
             </w:r>
             <w:proofErr w:type="spellEnd"/>
             <w:r>
-              <w:t>}, a través de la Plataforma Nacional de Transparencia, registrada con el número de folio {folio}, que se adjunta, la cual tiene como fecha de vencimiento para su atención el día {</w:t>
+              <w:rPr>
+                <w:rFonts w:ascii="Gill Sans MT" w:hAnsi="Gill Sans MT"/>
+                <w:sz w:val="24"/>
+                <w:szCs w:val="24"/>
+              </w:rPr>
+              <w:t>}, a través de la Plataforma Nacional de Transparencia, registrada con el número de folio {folio</w:t>
+            </w:r>
+            <w:r>
+              <w:rPr>
+                <w:rFonts w:ascii="Gill Sans MT" w:hAnsi="Gill Sans MT"/>
+                <w:sz w:val="24"/>
+                <w:szCs w:val="24"/>
+              </w:rPr>
+              <w:t>}, que se adjunta, la cual tiene como fecha de vencimiento para su atención el día {</w:t>
             </w:r>
             <w:proofErr w:type="spellStart"/>
             <w:r>
+              <w:rPr>
+                <w:rFonts w:ascii="Gill Sans MT" w:hAnsi="Gill Sans MT"/>
+                <w:sz w:val="24"/>
+                <w:szCs w:val="24"/>
+              </w:rPr>
               <w:t>fechaMaxima</w:t>
             </w:r>
             <w:proofErr w:type="spellEnd"/>
             <w:r>
+              <w:rPr>
+                <w:rFonts w:ascii="Gill Sans MT" w:hAnsi="Gill Sans MT"/>
+                <w:sz w:val="24"/>
+                <w:szCs w:val="24"/>
+              </w:rPr>
               <w:t>}.</w:t>
             </w:r>
           </w:p>
@@ -410,45 +762,109 @@
             <w:pPr>
               <w:spacing w:after="200"/>
               <w:jc w:val="both"/>
-            </w:pPr>
-            <w:r>
-              <w:t>Lo anterior, con la finalidad de que, en el ámbito de su competencia, se lleve a cabo el análisis respectivo y se otorgue la respuesta que corresponda, conforme a los plazos establecidos en el artículo 116 de la Ley Número 250 de Transparencia y Acceso a la Información Pública del Estado de Veracruz de Ignacio de la Llave, a través de los medios establecidos por la Coordinación Universitaria de Transparencia, Acceso a la Información y Protección de Datos Personales (CUTAI).</w:t>
+              <w:rPr>
+                <w:rFonts w:ascii="Gill Sans MT" w:hAnsi="Gill Sans MT"/>
+                <w:sz w:val="24"/>
+                <w:szCs w:val="24"/>
+              </w:rPr>
+            </w:pPr>
+            <w:r>
+              <w:rPr>
+                <w:rFonts w:ascii="Gill Sans MT" w:hAnsi="Gill Sans MT"/>
+                <w:sz w:val="24"/>
+                <w:szCs w:val="24"/>
+              </w:rPr>
+              <w:t>Lo anterior, con la finalidad de que, en el ámbito de su competencia, se lleve a cabo el análisis respectivo y se otorgue la respuesta que corresponda, confor</w:t>
+            </w:r>
+            <w:r>
+              <w:rPr>
+                <w:rFonts w:ascii="Gill Sans MT" w:hAnsi="Gill Sans MT"/>
+                <w:sz w:val="24"/>
+                <w:szCs w:val="24"/>
+              </w:rPr>
+              <w:t>me a los plazos establecidos en el artículo 116 de la Ley Número 250 de Transparencia y Acceso a la Información Pública del Estado de Veracruz de Ignacio de la Llave, a través de los medios establecidos por la Coordinación Universitaria de Transparencia, A</w:t>
+            </w:r>
+            <w:r>
+              <w:rPr>
+                <w:rFonts w:ascii="Gill Sans MT" w:hAnsi="Gill Sans MT"/>
+                <w:sz w:val="24"/>
+                <w:szCs w:val="24"/>
+              </w:rPr>
+              <w:t>cceso a la Información y Protección de Datos Personales (CUTAI).</w:t>
             </w:r>
           </w:p>
           <w:p>
             <w:pPr>
               <w:spacing w:after="400"/>
               <w:jc w:val="both"/>
-            </w:pPr>
-            <w:r>
+              <w:rPr>
+                <w:rFonts w:ascii="Gill Sans MT" w:hAnsi="Gill Sans MT"/>
+                <w:sz w:val="24"/>
+                <w:szCs w:val="24"/>
+              </w:rPr>
+            </w:pPr>
+            <w:r>
+              <w:rPr>
+                <w:rFonts w:ascii="Gill Sans MT" w:hAnsi="Gill Sans MT"/>
+                <w:sz w:val="24"/>
+                <w:szCs w:val="24"/>
+              </w:rPr>
               <w:t>Sin otro particular, hago propicia la ocasión para enviarle un cordial saludo.</w:t>
             </w:r>
           </w:p>
           <w:p>
             <w:pPr>
               <w:jc w:val="center"/>
-            </w:pPr>
-            <w:r>
-              <w:rPr>
+              <w:rPr>
+                <w:rFonts w:ascii="Gill Sans MT" w:hAnsi="Gill Sans MT"/>
+                <w:sz w:val="24"/>
+                <w:szCs w:val="24"/>
+              </w:rPr>
+            </w:pPr>
+            <w:r>
+              <w:rPr>
+                <w:rFonts w:ascii="Gill Sans MT" w:hAnsi="Gill Sans MT"/>
                 <w:b/>
                 <w:bCs/>
+                <w:sz w:val="24"/>
+                <w:szCs w:val="24"/>
               </w:rPr>
               <w:t>A T E N T A M E N T E.</w:t>
             </w:r>
             <w:r>
+              <w:rPr>
+                <w:rFonts w:ascii="Gill Sans MT" w:hAnsi="Gill Sans MT"/>
+                <w:sz w:val="24"/>
+                <w:szCs w:val="24"/>
+              </w:rPr>
               <w:br/>
               <w:t xml:space="preserve"> “Lis de Veracruz: Arte, Ciencia, Luz”</w:t>
             </w:r>
             <w:r>
+              <w:rPr>
+                <w:rFonts w:ascii="Gill Sans MT" w:hAnsi="Gill Sans MT"/>
+                <w:sz w:val="24"/>
+                <w:szCs w:val="24"/>
+              </w:rPr>
               <w:br/>
               <w:t xml:space="preserve"> Xalapa, Ver., a {</w:t>
             </w:r>
             <w:proofErr w:type="spellStart"/>
             <w:r>
+              <w:rPr>
+                <w:rFonts w:ascii="Gill Sans MT" w:hAnsi="Gill Sans MT"/>
+                <w:sz w:val="24"/>
+                <w:szCs w:val="24"/>
+              </w:rPr>
               <w:t>fechaHoyLong</w:t>
             </w:r>
             <w:proofErr w:type="spellEnd"/>
             <w:r>
+              <w:rPr>
+                <w:rFonts w:ascii="Gill Sans MT" w:hAnsi="Gill Sans MT"/>
+                <w:sz w:val="24"/>
+                <w:szCs w:val="24"/>
+              </w:rPr>
               <w:t>}</w:t>
             </w:r>
           </w:p>
@@ -456,15 +872,38 @@
             <w:pPr>
               <w:spacing w:before="800"/>
               <w:jc w:val="center"/>
-            </w:pPr>
-            <w:r>
-              <w:rPr>
+              <w:rPr>
+                <w:rFonts w:ascii="Gill Sans MT" w:hAnsi="Gill Sans MT"/>
+                <w:sz w:val="24"/>
+                <w:szCs w:val="24"/>
+              </w:rPr>
+            </w:pPr>
+            <w:r>
+              <w:rPr>
+                <w:rFonts w:ascii="Gill Sans MT" w:hAnsi="Gill Sans MT"/>
                 <w:b/>
                 <w:bCs/>
-              </w:rPr>
-              <w:t>M.A.P. Norma Hilda Jiménez Martínez</w:t>
-            </w:r>
-            <w:r>
+                <w:sz w:val="24"/>
+                <w:szCs w:val="24"/>
+              </w:rPr>
+              <w:t>M.A.P. Norma Hilda</w:t>
+            </w:r>
+            <w:r>
+              <w:rPr>
+                <w:rFonts w:ascii="Gill Sans MT" w:hAnsi="Gill Sans MT"/>
+                <w:b/>
+                <w:bCs/>
+                <w:sz w:val="24"/>
+                <w:szCs w:val="24"/>
+              </w:rPr>
+              <w:t xml:space="preserve"> Jiménez Martínez</w:t>
+            </w:r>
+            <w:r>
+              <w:rPr>
+                <w:rFonts w:ascii="Gill Sans MT" w:hAnsi="Gill Sans MT"/>
+                <w:sz w:val="24"/>
+                <w:szCs w:val="24"/>
+              </w:rPr>
               <w:br/>
               <w:t xml:space="preserve"> Contralora General</w:t>
             </w:r>
@@ -472,10 +911,14 @@
           <w:p>
             <w:pPr>
               <w:spacing w:before="400"/>
+              <w:rPr>
+                <w:rFonts w:ascii="Gill Sans MT" w:hAnsi="Gill Sans MT"/>
+              </w:rPr>
             </w:pPr>
             <w:proofErr w:type="spellStart"/>
             <w:r>
               <w:rPr>
+                <w:rFonts w:ascii="Gill Sans MT" w:hAnsi="Gill Sans MT"/>
                 <w:sz w:val="14"/>
                 <w:szCs w:val="14"/>
               </w:rPr>
@@ -484,6 +927,7 @@
             <w:proofErr w:type="spellEnd"/>
             <w:r>
               <w:rPr>
+                <w:rFonts w:ascii="Gill Sans MT" w:hAnsi="Gill Sans MT"/>
                 <w:sz w:val="14"/>
                 <w:szCs w:val="14"/>
               </w:rPr>
@@ -505,7 +949,7 @@
 </file>
 
 <file path=word/numbering.xml><?xml version="1.0" encoding="utf-8"?>
-<w:numbering xmlns:wpc="http://schemas.microsoft.com/office/word/2010/wordprocessingCanvas" xmlns:cx="http://schemas.microsoft.com/office/drawing/2014/chartex" xmlns:cx1="http://schemas.microsoft.com/office/drawing/2015/9/8/chartex" xmlns:cx2="http://schemas.microsoft.com/office/drawing/2015/10/21/chartex" xmlns:cx3="http://schemas.microsoft.com/office/drawing/2016/5/9/chartex" xmlns:cx4="http://schemas.microsoft.com/office/drawing/2016/5/10/chartex" xmlns:cx5="http://schemas.microsoft.com/office/drawing/2016/5/11/chartex" xmlns:cx6="http://schemas.microsoft.com/office/drawing/2016/5/12/chartex" xmlns:cx7="http://schemas.microsoft.com/office/drawing/2016/5/13/chartex" xmlns:cx8="http://schemas.microsoft.com/office/drawing/2016/5/14/chartex" xmlns:mc="http://schemas.openxmlformats.org/markup-compatibility/2006" xmlns:aink="http://schemas.microsoft.com/office/drawing/2016/ink" xmlns:am3d="http://schemas.microsoft.com/office/drawing/2017/model3d" xmlns:o="urn:schemas-microsoft-com:office:office" xmlns:oel="http://schemas.microsoft.com/office/2019/extlst" xmlns:r="http://schemas.openxmlformats.org/officeDocument/2006/relationships" xmlns:m="http://schemas.openxmlformats.org/officeDocument/2006/math" xmlns:v="urn:schemas-microsoft-com:vml" xmlns:wp14="http://schemas.microsoft.com/office/word/2010/wordprocessingDrawing" xmlns:wp="http://schemas.openxmlformats.org/drawingml/2006/wordprocessingDrawing" xmlns:w10="urn:schemas-microsoft-com:office:word" xmlns:w="http://schemas.openxmlformats.org/wordprocessingml/2006/main" xmlns:w14="http://schemas.microsoft.com/office/word/2010/wordml" xmlns:w15="http://schemas.microsoft.com/office/word/2012/wordml" xmlns:w16cex="http://schemas.microsoft.com/office/word/2018/wordml/cex" xmlns:w16cid="http://schemas.microsoft.com/office/word/2016/wordml/cid" xmlns:w16="http://schemas.microsoft.com/office/word/2018/wordml" xmlns:w16du="http://schemas.microsoft.com/office/word/2023/wordml/word16du" xmlns:w16sdtdh="http://schemas.microsoft.com/office/word/2020/wordml/sdtdatahash" xmlns:w16sdtfl="http://schemas.microsoft.com/office/word/2024/wordml/sdtformatlock" xmlns:w16se="http://schemas.microsoft.com/office/word/2015/wordml/symex" xmlns:wpg="http://schemas.microsoft.com/office/word/2010/wordprocessingGroup" xmlns:wpi="http://schemas.microsoft.com/office/word/2010/wordprocessingInk" xmlns:wne="http://schemas.microsoft.com/office/word/2006/wordml" xmlns:wps="http://schemas.microsoft.com/office/word/2010/wordprocessingShape" mc:Ignorable="w14 w15 w16se w16cid w16 w16cex w16sdtdh w16sdtfl w16du wp14">
+<w:numbering xmlns:wpc="http://schemas.microsoft.com/office/word/2010/wordprocessingCanvas" xmlns:cx="http://schemas.microsoft.com/office/drawing/2014/chartex" xmlns:cx1="http://schemas.microsoft.com/office/drawing/2015/9/8/chartex" xmlns:cx2="http://schemas.microsoft.com/office/drawing/2015/10/21/chartex" xmlns:cx3="http://schemas.microsoft.com/office/drawing/2016/5/9/chartex" xmlns:cx4="http://schemas.microsoft.com/office/drawing/2016/5/10/chartex" xmlns:cx5="http://schemas.microsoft.com/office/drawing/2016/5/11/chartex" xmlns:cx6="http://schemas.microsoft.com/office/drawing/2016/5/12/chartex" xmlns:cx7="http://schemas.microsoft.com/office/drawing/2016/5/13/chartex" xmlns:cx8="http://schemas.microsoft.com/office/drawing/2016/5/14/chartex" xmlns:mc="http://schemas.openxmlformats.org/markup-compatibility/2006" xmlns:aink="http://schemas.microsoft.com/office/drawing/2016/ink" xmlns:am3d="http://schemas.microsoft.com/office/drawing/2017/model3d" xmlns:o="urn:schemas-microsoft-com:office:office" xmlns:r="http://schemas.openxmlformats.org/officeDocument/2006/relationships" xmlns:m="http://schemas.openxmlformats.org/officeDocument/2006/math" xmlns:v="urn:schemas-microsoft-com:vml" xmlns:wp14="http://schemas.microsoft.com/office/word/2010/wordprocessingDrawing" xmlns:wp="http://schemas.openxmlformats.org/drawingml/2006/wordprocessingDrawing" xmlns:w10="urn:schemas-microsoft-com:office:word" xmlns:w="http://schemas.openxmlformats.org/wordprocessingml/2006/main" xmlns:w14="http://schemas.microsoft.com/office/word/2010/wordml" xmlns:w15="http://schemas.microsoft.com/office/word/2012/wordml" xmlns:w16cex="http://schemas.microsoft.com/office/word/2018/wordml/cex" xmlns:w16cid="http://schemas.microsoft.com/office/word/2016/wordml/cid" xmlns:w16="http://schemas.microsoft.com/office/word/2018/wordml" xmlns:w16sdtdh="http://schemas.microsoft.com/office/word/2020/wordml/sdtdatahash" xmlns:w16se="http://schemas.microsoft.com/office/word/2015/wordml/symex" xmlns:wpg="http://schemas.microsoft.com/office/word/2010/wordprocessingGroup" xmlns:wpi="http://schemas.microsoft.com/office/word/2010/wordprocessingInk" xmlns:wne="http://schemas.microsoft.com/office/word/2006/wordml" xmlns:wps="http://schemas.microsoft.com/office/word/2010/wordprocessingShape" mc:Ignorable="w14 w15 w16se w16cid w16 w16cex w16sdtdh wp14">
   <w:abstractNum w:abstractNumId="0" w15:restartNumberingAfterBreak="0">
     <w:nsid w:val="03B742C1"/>
     <w:multiLevelType w:val="hybridMultilevel"/>
@@ -592,7 +1036,7 @@
       </w:pPr>
     </w:lvl>
   </w:abstractNum>
-  <w:num w:numId="1" w16cid:durableId="1070616822">
+  <w:num w:numId="1">
     <w:abstractNumId w:val="0"/>
     <w:lvlOverride w:ilvl="0">
       <w:startOverride w:val="1"/>
@@ -602,7 +1046,7 @@
 </file>
 
 <file path=word/styles.xml><?xml version="1.0" encoding="utf-8"?>
-<w:styles xmlns:mc="http://schemas.openxmlformats.org/markup-compatibility/2006" xmlns:r="http://schemas.openxmlformats.org/officeDocument/2006/relationships" xmlns:w="http://schemas.openxmlformats.org/wordprocessingml/2006/main" xmlns:w14="http://schemas.microsoft.com/office/word/2010/wordml" xmlns:w15="http://schemas.microsoft.com/office/word/2012/wordml" xmlns:w16cex="http://schemas.microsoft.com/office/word/2018/wordml/cex" xmlns:w16cid="http://schemas.microsoft.com/office/word/2016/wordml/cid" xmlns:w16="http://schemas.microsoft.com/office/word/2018/wordml" xmlns:w16du="http://schemas.microsoft.com/office/word/2023/wordml/word16du" xmlns:w16sdtdh="http://schemas.microsoft.com/office/word/2020/wordml/sdtdatahash" xmlns:w16sdtfl="http://schemas.microsoft.com/office/word/2024/wordml/sdtformatlock" xmlns:w16se="http://schemas.microsoft.com/office/word/2015/wordml/symex" mc:Ignorable="w14 w15 w16se w16cid w16 w16cex w16sdtdh w16sdtfl w16du">
+<w:styles xmlns:mc="http://schemas.openxmlformats.org/markup-compatibility/2006" xmlns:r="http://schemas.openxmlformats.org/officeDocument/2006/relationships" xmlns:w="http://schemas.openxmlformats.org/wordprocessingml/2006/main" xmlns:w14="http://schemas.microsoft.com/office/word/2010/wordml" xmlns:w15="http://schemas.microsoft.com/office/word/2012/wordml" xmlns:w16cex="http://schemas.microsoft.com/office/word/2018/wordml/cex" xmlns:w16cid="http://schemas.microsoft.com/office/word/2016/wordml/cid" xmlns:w16="http://schemas.microsoft.com/office/word/2018/wordml" xmlns:w16sdtdh="http://schemas.microsoft.com/office/word/2020/wordml/sdtdatahash" xmlns:w16se="http://schemas.microsoft.com/office/word/2015/wordml/symex" mc:Ignorable="w14 w15 w16se w16cid w16 w16cex w16sdtdh">
   <w:docDefaults>
     <w:rPrDefault>
       <w:rPr>

</xml_diff>

<commit_message>
Primera versión funcional y estable
</commit_message>
<xml_diff>
--- a/backend/templates/Plantilla Oficio Solicitud Transparencia.docx
+++ b/backend/templates/Plantilla Oficio Solicitud Transparencia.docx
@@ -2,6 +2,300 @@
 <file path=word/document.xml><?xml version="1.0" encoding="utf-8"?>
 <w:document xmlns:wpc="http://schemas.microsoft.com/office/word/2010/wordprocessingCanvas" xmlns:cx="http://schemas.microsoft.com/office/drawing/2014/chartex" xmlns:cx1="http://schemas.microsoft.com/office/drawing/2015/9/8/chartex" xmlns:cx2="http://schemas.microsoft.com/office/drawing/2015/10/21/chartex" xmlns:cx3="http://schemas.microsoft.com/office/drawing/2016/5/9/chartex" xmlns:cx4="http://schemas.microsoft.com/office/drawing/2016/5/10/chartex" xmlns:cx5="http://schemas.microsoft.com/office/drawing/2016/5/11/chartex" xmlns:cx6="http://schemas.microsoft.com/office/drawing/2016/5/12/chartex" xmlns:cx7="http://schemas.microsoft.com/office/drawing/2016/5/13/chartex" xmlns:cx8="http://schemas.microsoft.com/office/drawing/2016/5/14/chartex" xmlns:mc="http://schemas.openxmlformats.org/markup-compatibility/2006" xmlns:aink="http://schemas.microsoft.com/office/drawing/2016/ink" xmlns:am3d="http://schemas.microsoft.com/office/drawing/2017/model3d" xmlns:o="urn:schemas-microsoft-com:office:office" xmlns:r="http://schemas.openxmlformats.org/officeDocument/2006/relationships" xmlns:m="http://schemas.openxmlformats.org/officeDocument/2006/math" xmlns:v="urn:schemas-microsoft-com:vml" xmlns:wp14="http://schemas.microsoft.com/office/word/2010/wordprocessingDrawing" xmlns:wp="http://schemas.openxmlformats.org/drawingml/2006/wordprocessingDrawing" xmlns:w10="urn:schemas-microsoft-com:office:word" xmlns:w="http://schemas.openxmlformats.org/wordprocessingml/2006/main" xmlns:w14="http://schemas.microsoft.com/office/word/2010/wordml" xmlns:w15="http://schemas.microsoft.com/office/word/2012/wordml" xmlns:w16cex="http://schemas.microsoft.com/office/word/2018/wordml/cex" xmlns:w16cid="http://schemas.microsoft.com/office/word/2016/wordml/cid" xmlns:w16="http://schemas.microsoft.com/office/word/2018/wordml" xmlns:w16sdtdh="http://schemas.microsoft.com/office/word/2020/wordml/sdtdatahash" xmlns:w16se="http://schemas.microsoft.com/office/word/2015/wordml/symex" xmlns:wpg="http://schemas.microsoft.com/office/word/2010/wordprocessingGroup" xmlns:wpi="http://schemas.microsoft.com/office/word/2010/wordprocessingInk" xmlns:wne="http://schemas.microsoft.com/office/word/2006/wordml" xmlns:wps="http://schemas.microsoft.com/office/word/2010/wordprocessingShape" mc:Ignorable="w14 w15 w16se w16cid w16 w16cex w16sdtdh wp14">
   <w:body>
+    <w:p>
+      <w:pPr>
+        <w:jc w:val="right"/>
+        <w:rPr>
+          <w:b/>
+          <w:bCs/>
+        </w:rPr>
+      </w:pPr>
+      <w:r>
+        <w:rPr>
+          <w:rFonts w:ascii="Gill Sans MT" w:hAnsi="Gill Sans MT"/>
+          <w:b/>
+          <w:noProof/>
+          <w:sz w:val="14"/>
+        </w:rPr>
+        <mc:AlternateContent>
+          <mc:Choice Requires="wpg">
+            <w:drawing>
+              <wp:anchor distT="0" distB="0" distL="114300" distR="114300" simplePos="0" relativeHeight="251659264" behindDoc="0" locked="0" layoutInCell="1" allowOverlap="1" wp14:anchorId="42971244" wp14:editId="2E7C5313">
+                <wp:simplePos x="0" y="0"/>
+                <wp:positionH relativeFrom="column">
+                  <wp:posOffset>4662793</wp:posOffset>
+                </wp:positionH>
+                <wp:positionV relativeFrom="paragraph">
+                  <wp:posOffset>-547562</wp:posOffset>
+                </wp:positionV>
+                <wp:extent cx="1426476" cy="1553951"/>
+                <wp:effectExtent l="0" t="0" r="2540" b="0"/>
+                <wp:wrapNone/>
+                <wp:docPr id="24" name="Grupo 24"/>
+                <wp:cNvGraphicFramePr/>
+                <a:graphic xmlns:a="http://schemas.openxmlformats.org/drawingml/2006/main">
+                  <a:graphicData uri="http://schemas.microsoft.com/office/word/2010/wordprocessingGroup">
+                    <wpg:wgp>
+                      <wpg:cNvGrpSpPr/>
+                      <wpg:grpSpPr>
+                        <a:xfrm>
+                          <a:off x="0" y="0"/>
+                          <a:ext cx="1426476" cy="1553951"/>
+                          <a:chOff x="0" y="0"/>
+                          <a:chExt cx="1568450" cy="1628409"/>
+                        </a:xfrm>
+                      </wpg:grpSpPr>
+                      <pic:pic xmlns:pic="http://schemas.openxmlformats.org/drawingml/2006/picture">
+                        <pic:nvPicPr>
+                          <pic:cNvPr id="23" name="0 Imagen"/>
+                          <pic:cNvPicPr>
+                            <a:picLocks noChangeAspect="1"/>
+                          </pic:cNvPicPr>
+                        </pic:nvPicPr>
+                        <pic:blipFill>
+                          <a:blip r:embed="rId7" cstate="print">
+                            <a:alphaModFix amt="59000"/>
+                            <a:extLst>
+                              <a:ext uri="{28A0092B-C50C-407E-A947-70E740481C1C}">
+                                <a14:useLocalDpi xmlns:a14="http://schemas.microsoft.com/office/drawing/2010/main" val="0"/>
+                              </a:ext>
+                            </a:extLst>
+                          </a:blip>
+                          <a:srcRect/>
+                          <a:stretch>
+                            <a:fillRect/>
+                          </a:stretch>
+                        </pic:blipFill>
+                        <pic:spPr bwMode="auto">
+                          <a:xfrm>
+                            <a:off x="75144" y="0"/>
+                            <a:ext cx="1446018" cy="1238446"/>
+                          </a:xfrm>
+                          <a:prstGeom prst="rect">
+                            <a:avLst/>
+                          </a:prstGeom>
+                          <a:noFill/>
+                        </pic:spPr>
+                      </pic:pic>
+                      <wps:wsp>
+                        <wps:cNvPr id="1" name="Cuadro de texto 1"/>
+                        <wps:cNvSpPr txBox="1"/>
+                        <wps:spPr>
+                          <a:xfrm>
+                            <a:off x="0" y="1218291"/>
+                            <a:ext cx="1568450" cy="410118"/>
+                          </a:xfrm>
+                          <a:prstGeom prst="rect">
+                            <a:avLst/>
+                          </a:prstGeom>
+                          <a:noFill/>
+                          <a:ln w="6350">
+                            <a:noFill/>
+                          </a:ln>
+                        </wps:spPr>
+                        <wps:txbx>
+                          <w:txbxContent>
+                            <w:p>
+                              <w:pPr>
+                                <w:jc w:val="center"/>
+                                <w:rPr>
+                                  <w:rFonts w:ascii="Gill Sans MT" w:hAnsi="Gill Sans MT"/>
+                                  <w:color w:val="A6A6A6" w:themeColor="background1" w:themeShade="A6"/>
+                                  <w:spacing w:val="10"/>
+                                  <w:sz w:val="18"/>
+                                  <w:szCs w:val="18"/>
+                                </w:rPr>
+                              </w:pPr>
+                              <w:r>
+                                <w:rPr>
+                                  <w:rFonts w:ascii="Gill Sans MT" w:hAnsi="Gill Sans MT"/>
+                                  <w:color w:val="A6A6A6" w:themeColor="background1" w:themeShade="A6"/>
+                                  <w:spacing w:val="10"/>
+                                  <w:sz w:val="18"/>
+                                  <w:szCs w:val="18"/>
+                                </w:rPr>
+                                <w:t>Junta de Gobierno</w:t>
+                              </w:r>
+                            </w:p>
+                            <w:p>
+                              <w:pPr>
+                                <w:jc w:val="center"/>
+                                <w:rPr>
+                                  <w:rFonts w:ascii="Gill Sans MT" w:hAnsi="Gill Sans MT"/>
+                                  <w:spacing w:val="10"/>
+                                  <w:sz w:val="18"/>
+                                  <w:szCs w:val="18"/>
+                                </w:rPr>
+                              </w:pPr>
+                              <w:r>
+                                <w:rPr>
+                                  <w:rFonts w:ascii="Gill Sans MT" w:hAnsi="Gill Sans MT"/>
+                                  <w:color w:val="A6A6A6" w:themeColor="background1" w:themeShade="A6"/>
+                                  <w:spacing w:val="10"/>
+                                  <w:sz w:val="18"/>
+                                  <w:szCs w:val="18"/>
+                                </w:rPr>
+                                <w:t>Contraloría General</w:t>
+                              </w:r>
+                            </w:p>
+                          </w:txbxContent>
+                        </wps:txbx>
+                        <wps:bodyPr rot="0" spcFirstLastPara="0" vertOverflow="overflow" horzOverflow="overflow" vert="horz" wrap="square" lIns="91440" tIns="45720" rIns="91440" bIns="45720" numCol="1" spcCol="0" rtlCol="0" fromWordArt="0" anchor="t" anchorCtr="0" forceAA="0" compatLnSpc="1">
+                          <a:prstTxWarp prst="textNoShape">
+                            <a:avLst/>
+                          </a:prstTxWarp>
+                          <a:noAutofit/>
+                        </wps:bodyPr>
+                      </wps:wsp>
+                    </wpg:wgp>
+                  </a:graphicData>
+                </a:graphic>
+                <wp14:sizeRelH relativeFrom="margin">
+                  <wp14:pctWidth>0</wp14:pctWidth>
+                </wp14:sizeRelH>
+                <wp14:sizeRelV relativeFrom="margin">
+                  <wp14:pctHeight>0</wp14:pctHeight>
+                </wp14:sizeRelV>
+              </wp:anchor>
+            </w:drawing>
+          </mc:Choice>
+          <mc:Fallback>
+            <w:pict>
+              <v:group w14:anchorId="42971244" id="Grupo 24" o:spid="_x0000_s1026" style="position:absolute;left:0;text-align:left;margin-left:367.15pt;margin-top:-43.1pt;width:112.3pt;height:122.35pt;z-index:251659264;mso-width-relative:margin;mso-height-relative:margin" coordsize="15684,16284" o:gfxdata="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">
+                <v:shapetype id="_x0000_t75" coordsize="21600,21600" o:spt="75" o:preferrelative="t" path="m@4@5l@4@11@9@11@9@5xe" filled="f" stroked="f">
+                  <v:stroke joinstyle="miter"/>
+                  <v:formulas>
+                    <v:f eqn="if lineDrawn pixelLineWidth 0"/>
+                    <v:f eqn="sum @0 1 0"/>
+                    <v:f eqn="sum 0 0 @1"/>
+                    <v:f eqn="prod @2 1 2"/>
+                    <v:f eqn="prod @3 21600 pixelWidth"/>
+                    <v:f eqn="prod @3 21600 pixelHeight"/>
+                    <v:f eqn="sum @0 0 1"/>
+                    <v:f eqn="prod @6 1 2"/>
+                    <v:f eqn="prod @7 21600 pixelWidth"/>
+                    <v:f eqn="sum @8 21600 0"/>
+                    <v:f eqn="prod @7 21600 pixelHeight"/>
+                    <v:f eqn="sum @10 21600 0"/>
+                  </v:formulas>
+                  <v:path o:extrusionok="f" gradientshapeok="t" o:connecttype="rect"/>
+                  <o:lock v:ext="edit" aspectratio="t"/>
+                </v:shapetype>
+                <v:shape id="0 Imagen" o:spid="_x0000_s1027" type="#_x0000_t75" style="position:absolute;left:751;width:14460;height:12384;visibility:visible;mso-wrap-style:square" o:gfxdata="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">
+                  <v:imagedata r:id="rId8" o:title=""/>
+                </v:shape>
+                <v:shapetype id="_x0000_t202" coordsize="21600,21600" o:spt="202" path="m,l,21600r21600,l21600,xe">
+                  <v:stroke joinstyle="miter"/>
+                  <v:path gradientshapeok="t" o:connecttype="rect"/>
+                </v:shapetype>
+                <v:shape id="Cuadro de texto 1" o:spid="_x0000_s1028" type="#_x0000_t202" style="position:absolute;top:12182;width:15684;height:4102;visibility:visible;mso-wrap-style:square;v-text-anchor:top" o:gfxdata="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" filled="f" stroked="f" strokeweight=".5pt">
+                  <v:textbox>
+                    <w:txbxContent>
+                      <w:p>
+                        <w:pPr>
+                          <w:jc w:val="center"/>
+                          <w:rPr>
+                            <w:rFonts w:ascii="Gill Sans MT" w:hAnsi="Gill Sans MT"/>
+                            <w:color w:val="A6A6A6" w:themeColor="background1" w:themeShade="A6"/>
+                            <w:spacing w:val="10"/>
+                            <w:sz w:val="18"/>
+                            <w:szCs w:val="18"/>
+                          </w:rPr>
+                        </w:pPr>
+                        <w:r>
+                          <w:rPr>
+                            <w:rFonts w:ascii="Gill Sans MT" w:hAnsi="Gill Sans MT"/>
+                            <w:color w:val="A6A6A6" w:themeColor="background1" w:themeShade="A6"/>
+                            <w:spacing w:val="10"/>
+                            <w:sz w:val="18"/>
+                            <w:szCs w:val="18"/>
+                          </w:rPr>
+                          <w:t>Junta de Gobierno</w:t>
+                        </w:r>
+                      </w:p>
+                      <w:p>
+                        <w:pPr>
+                          <w:jc w:val="center"/>
+                          <w:rPr>
+                            <w:rFonts w:ascii="Gill Sans MT" w:hAnsi="Gill Sans MT"/>
+                            <w:spacing w:val="10"/>
+                            <w:sz w:val="18"/>
+                            <w:szCs w:val="18"/>
+                          </w:rPr>
+                        </w:pPr>
+                        <w:r>
+                          <w:rPr>
+                            <w:rFonts w:ascii="Gill Sans MT" w:hAnsi="Gill Sans MT"/>
+                            <w:color w:val="A6A6A6" w:themeColor="background1" w:themeShade="A6"/>
+                            <w:spacing w:val="10"/>
+                            <w:sz w:val="18"/>
+                            <w:szCs w:val="18"/>
+                          </w:rPr>
+                          <w:t>Contraloría General</w:t>
+                        </w:r>
+                      </w:p>
+                    </w:txbxContent>
+                  </v:textbox>
+                </v:shape>
+              </v:group>
+            </w:pict>
+          </mc:Fallback>
+        </mc:AlternateContent>
+      </w:r>
+    </w:p>
+    <w:p>
+      <w:pPr>
+        <w:jc w:val="right"/>
+        <w:rPr>
+          <w:b/>
+          <w:bCs/>
+        </w:rPr>
+      </w:pPr>
+    </w:p>
+    <w:p>
+      <w:pPr>
+        <w:jc w:val="right"/>
+        <w:rPr>
+          <w:b/>
+          <w:bCs/>
+        </w:rPr>
+      </w:pPr>
+    </w:p>
+    <w:p>
+      <w:pPr>
+        <w:jc w:val="right"/>
+        <w:rPr>
+          <w:b/>
+          <w:bCs/>
+        </w:rPr>
+      </w:pPr>
+    </w:p>
+    <w:p>
+      <w:pPr>
+        <w:jc w:val="right"/>
+        <w:rPr>
+          <w:b/>
+          <w:bCs/>
+        </w:rPr>
+      </w:pPr>
+    </w:p>
+    <w:p>
+      <w:pPr>
+        <w:jc w:val="right"/>
+        <w:rPr>
+          <w:b/>
+          <w:bCs/>
+        </w:rPr>
+      </w:pPr>
+    </w:p>
+    <w:p>
+      <w:pPr>
+        <w:rPr>
+          <w:b/>
+          <w:bCs/>
+        </w:rPr>
+      </w:pPr>
+    </w:p>
     <w:p>
       <w:pPr>
         <w:jc w:val="right"/>
@@ -133,6 +427,7 @@
               <w:rPr>
                 <w:rFonts w:ascii="Gill Sans MT" w:hAnsi="Gill Sans MT"/>
                 <w:b/>
+                <w:color w:val="808080" w:themeColor="background1" w:themeShade="80"/>
                 <w:sz w:val="16"/>
                 <w:szCs w:val="16"/>
               </w:rPr>
@@ -141,6 +436,7 @@
               <w:rPr>
                 <w:rFonts w:ascii="Gill Sans MT" w:hAnsi="Gill Sans MT"/>
                 <w:b/>
+                <w:color w:val="808080" w:themeColor="background1" w:themeShade="80"/>
                 <w:sz w:val="16"/>
                 <w:szCs w:val="16"/>
               </w:rPr>
@@ -152,6 +448,7 @@
               <w:jc w:val="right"/>
               <w:rPr>
                 <w:rFonts w:ascii="Gill Sans MT" w:hAnsi="Gill Sans MT"/>
+                <w:color w:val="808080" w:themeColor="background1" w:themeShade="80"/>
                 <w:sz w:val="18"/>
                 <w:szCs w:val="12"/>
               </w:rPr>
@@ -162,13 +459,15 @@
               <w:jc w:val="right"/>
               <w:rPr>
                 <w:rFonts w:ascii="Gill Sans MT" w:hAnsi="Gill Sans MT"/>
-                <w:sz w:val="16"/>
-                <w:szCs w:val="14"/>
-              </w:rPr>
-            </w:pPr>
-            <w:r>
-              <w:rPr>
-                <w:rFonts w:ascii="Gill Sans MT" w:hAnsi="Gill Sans MT"/>
+                <w:color w:val="808080" w:themeColor="background1" w:themeShade="80"/>
+                <w:sz w:val="16"/>
+                <w:szCs w:val="14"/>
+              </w:rPr>
+            </w:pPr>
+            <w:r>
+              <w:rPr>
+                <w:rFonts w:ascii="Gill Sans MT" w:hAnsi="Gill Sans MT"/>
+                <w:color w:val="808080" w:themeColor="background1" w:themeShade="80"/>
                 <w:sz w:val="16"/>
                 <w:szCs w:val="14"/>
               </w:rPr>
@@ -180,13 +479,15 @@
               <w:jc w:val="right"/>
               <w:rPr>
                 <w:rFonts w:ascii="Gill Sans MT" w:hAnsi="Gill Sans MT"/>
-                <w:sz w:val="16"/>
-                <w:szCs w:val="14"/>
-              </w:rPr>
-            </w:pPr>
-            <w:r>
-              <w:rPr>
-                <w:rFonts w:ascii="Gill Sans MT" w:hAnsi="Gill Sans MT"/>
+                <w:color w:val="808080" w:themeColor="background1" w:themeShade="80"/>
+                <w:sz w:val="16"/>
+                <w:szCs w:val="14"/>
+              </w:rPr>
+            </w:pPr>
+            <w:r>
+              <w:rPr>
+                <w:rFonts w:ascii="Gill Sans MT" w:hAnsi="Gill Sans MT"/>
+                <w:color w:val="808080" w:themeColor="background1" w:themeShade="80"/>
                 <w:sz w:val="16"/>
                 <w:szCs w:val="14"/>
               </w:rPr>
@@ -198,13 +499,15 @@
               <w:jc w:val="right"/>
               <w:rPr>
                 <w:rFonts w:ascii="Gill Sans MT" w:hAnsi="Gill Sans MT"/>
-                <w:sz w:val="16"/>
-                <w:szCs w:val="14"/>
-              </w:rPr>
-            </w:pPr>
-            <w:r>
-              <w:rPr>
-                <w:rFonts w:ascii="Gill Sans MT" w:hAnsi="Gill Sans MT"/>
+                <w:color w:val="808080" w:themeColor="background1" w:themeShade="80"/>
+                <w:sz w:val="16"/>
+                <w:szCs w:val="14"/>
+              </w:rPr>
+            </w:pPr>
+            <w:r>
+              <w:rPr>
+                <w:rFonts w:ascii="Gill Sans MT" w:hAnsi="Gill Sans MT"/>
+                <w:color w:val="808080" w:themeColor="background1" w:themeShade="80"/>
                 <w:sz w:val="16"/>
                 <w:szCs w:val="14"/>
               </w:rPr>
@@ -214,6 +517,7 @@
             <w:r>
               <w:rPr>
                 <w:rFonts w:ascii="Gill Sans MT" w:hAnsi="Gill Sans MT"/>
+                <w:color w:val="808080" w:themeColor="background1" w:themeShade="80"/>
                 <w:sz w:val="16"/>
                 <w:szCs w:val="14"/>
               </w:rPr>
@@ -223,6 +527,7 @@
             <w:r>
               <w:rPr>
                 <w:rFonts w:ascii="Gill Sans MT" w:hAnsi="Gill Sans MT"/>
+                <w:color w:val="808080" w:themeColor="background1" w:themeShade="80"/>
                 <w:sz w:val="16"/>
                 <w:szCs w:val="14"/>
               </w:rPr>
@@ -234,13 +539,15 @@
               <w:jc w:val="right"/>
               <w:rPr>
                 <w:rFonts w:ascii="Gill Sans MT" w:hAnsi="Gill Sans MT"/>
-                <w:sz w:val="16"/>
-                <w:szCs w:val="14"/>
-              </w:rPr>
-            </w:pPr>
-            <w:r>
-              <w:rPr>
-                <w:rFonts w:ascii="Gill Sans MT" w:hAnsi="Gill Sans MT"/>
+                <w:color w:val="808080" w:themeColor="background1" w:themeShade="80"/>
+                <w:sz w:val="16"/>
+                <w:szCs w:val="14"/>
+              </w:rPr>
+            </w:pPr>
+            <w:r>
+              <w:rPr>
+                <w:rFonts w:ascii="Gill Sans MT" w:hAnsi="Gill Sans MT"/>
+                <w:color w:val="808080" w:themeColor="background1" w:themeShade="80"/>
                 <w:sz w:val="16"/>
                 <w:szCs w:val="14"/>
               </w:rPr>
@@ -252,13 +559,15 @@
               <w:jc w:val="right"/>
               <w:rPr>
                 <w:rFonts w:ascii="Gill Sans MT" w:hAnsi="Gill Sans MT"/>
-                <w:sz w:val="16"/>
-                <w:szCs w:val="14"/>
-              </w:rPr>
-            </w:pPr>
-            <w:r>
-              <w:rPr>
-                <w:rFonts w:ascii="Gill Sans MT" w:hAnsi="Gill Sans MT"/>
+                <w:color w:val="808080" w:themeColor="background1" w:themeShade="80"/>
+                <w:sz w:val="16"/>
+                <w:szCs w:val="14"/>
+              </w:rPr>
+            </w:pPr>
+            <w:r>
+              <w:rPr>
+                <w:rFonts w:ascii="Gill Sans MT" w:hAnsi="Gill Sans MT"/>
+                <w:color w:val="808080" w:themeColor="background1" w:themeShade="80"/>
                 <w:sz w:val="16"/>
                 <w:szCs w:val="14"/>
               </w:rPr>
@@ -270,6 +579,7 @@
               <w:jc w:val="right"/>
               <w:rPr>
                 <w:rFonts w:ascii="Gill Sans MT" w:hAnsi="Gill Sans MT"/>
+                <w:color w:val="808080" w:themeColor="background1" w:themeShade="80"/>
                 <w:sz w:val="16"/>
                 <w:szCs w:val="14"/>
               </w:rPr>
@@ -281,6 +591,7 @@
               <w:rPr>
                 <w:rFonts w:ascii="Gill Sans MT" w:hAnsi="Gill Sans MT"/>
                 <w:b/>
+                <w:color w:val="808080" w:themeColor="background1" w:themeShade="80"/>
                 <w:sz w:val="16"/>
                 <w:szCs w:val="14"/>
               </w:rPr>
@@ -289,6 +600,7 @@
               <w:rPr>
                 <w:rFonts w:ascii="Gill Sans MT" w:hAnsi="Gill Sans MT"/>
                 <w:b/>
+                <w:color w:val="808080" w:themeColor="background1" w:themeShade="80"/>
                 <w:sz w:val="16"/>
                 <w:szCs w:val="14"/>
               </w:rPr>
@@ -300,13 +612,15 @@
               <w:jc w:val="right"/>
               <w:rPr>
                 <w:rFonts w:ascii="Gill Sans MT" w:hAnsi="Gill Sans MT"/>
-                <w:sz w:val="16"/>
-                <w:szCs w:val="14"/>
-              </w:rPr>
-            </w:pPr>
-            <w:r>
-              <w:rPr>
-                <w:rFonts w:ascii="Gill Sans MT" w:hAnsi="Gill Sans MT"/>
+                <w:color w:val="808080" w:themeColor="background1" w:themeShade="80"/>
+                <w:sz w:val="16"/>
+                <w:szCs w:val="14"/>
+              </w:rPr>
+            </w:pPr>
+            <w:r>
+              <w:rPr>
+                <w:rFonts w:ascii="Gill Sans MT" w:hAnsi="Gill Sans MT"/>
+                <w:color w:val="808080" w:themeColor="background1" w:themeShade="80"/>
                 <w:sz w:val="16"/>
                 <w:szCs w:val="14"/>
               </w:rPr>
@@ -318,13 +632,15 @@
               <w:jc w:val="right"/>
               <w:rPr>
                 <w:rFonts w:ascii="Gill Sans MT" w:hAnsi="Gill Sans MT"/>
-                <w:sz w:val="16"/>
-                <w:szCs w:val="14"/>
-              </w:rPr>
-            </w:pPr>
-            <w:r>
-              <w:rPr>
-                <w:rFonts w:ascii="Gill Sans MT" w:hAnsi="Gill Sans MT"/>
+                <w:color w:val="808080" w:themeColor="background1" w:themeShade="80"/>
+                <w:sz w:val="16"/>
+                <w:szCs w:val="14"/>
+              </w:rPr>
+            </w:pPr>
+            <w:r>
+              <w:rPr>
+                <w:rFonts w:ascii="Gill Sans MT" w:hAnsi="Gill Sans MT"/>
+                <w:color w:val="808080" w:themeColor="background1" w:themeShade="80"/>
                 <w:sz w:val="16"/>
                 <w:szCs w:val="14"/>
               </w:rPr>
@@ -336,13 +652,15 @@
               <w:jc w:val="right"/>
               <w:rPr>
                 <w:rFonts w:ascii="Gill Sans MT" w:hAnsi="Gill Sans MT"/>
-                <w:sz w:val="16"/>
-                <w:szCs w:val="14"/>
-              </w:rPr>
-            </w:pPr>
-            <w:r>
-              <w:rPr>
-                <w:rFonts w:ascii="Gill Sans MT" w:hAnsi="Gill Sans MT"/>
+                <w:color w:val="808080" w:themeColor="background1" w:themeShade="80"/>
+                <w:sz w:val="16"/>
+                <w:szCs w:val="14"/>
+              </w:rPr>
+            </w:pPr>
+            <w:r>
+              <w:rPr>
+                <w:rFonts w:ascii="Gill Sans MT" w:hAnsi="Gill Sans MT"/>
+                <w:color w:val="808080" w:themeColor="background1" w:themeShade="80"/>
                 <w:sz w:val="16"/>
                 <w:szCs w:val="14"/>
               </w:rPr>
@@ -354,6 +672,7 @@
               <w:jc w:val="right"/>
               <w:rPr>
                 <w:rFonts w:ascii="Gill Sans MT" w:hAnsi="Gill Sans MT"/>
+                <w:color w:val="808080" w:themeColor="background1" w:themeShade="80"/>
                 <w:sz w:val="16"/>
                 <w:szCs w:val="14"/>
               </w:rPr>
@@ -365,6 +684,7 @@
               <w:rPr>
                 <w:rFonts w:ascii="Gill Sans MT" w:hAnsi="Gill Sans MT"/>
                 <w:b/>
+                <w:color w:val="808080" w:themeColor="background1" w:themeShade="80"/>
                 <w:sz w:val="16"/>
                 <w:szCs w:val="14"/>
               </w:rPr>
@@ -373,6 +693,7 @@
               <w:rPr>
                 <w:rFonts w:ascii="Gill Sans MT" w:hAnsi="Gill Sans MT"/>
                 <w:b/>
+                <w:color w:val="808080" w:themeColor="background1" w:themeShade="80"/>
                 <w:sz w:val="16"/>
                 <w:szCs w:val="14"/>
               </w:rPr>
@@ -384,13 +705,15 @@
               <w:jc w:val="right"/>
               <w:rPr>
                 <w:rFonts w:ascii="Gill Sans MT" w:hAnsi="Gill Sans MT"/>
-                <w:sz w:val="16"/>
-                <w:szCs w:val="14"/>
-              </w:rPr>
-            </w:pPr>
-            <w:r>
-              <w:rPr>
-                <w:rFonts w:ascii="Gill Sans MT" w:hAnsi="Gill Sans MT"/>
+                <w:color w:val="808080" w:themeColor="background1" w:themeShade="80"/>
+                <w:sz w:val="16"/>
+                <w:szCs w:val="14"/>
+              </w:rPr>
+            </w:pPr>
+            <w:r>
+              <w:rPr>
+                <w:rFonts w:ascii="Gill Sans MT" w:hAnsi="Gill Sans MT"/>
+                <w:color w:val="808080" w:themeColor="background1" w:themeShade="80"/>
                 <w:sz w:val="16"/>
                 <w:szCs w:val="14"/>
               </w:rPr>
@@ -402,6 +725,7 @@
               <w:jc w:val="right"/>
               <w:rPr>
                 <w:rFonts w:ascii="Gill Sans MT" w:hAnsi="Gill Sans MT"/>
+                <w:color w:val="808080" w:themeColor="background1" w:themeShade="80"/>
                 <w:sz w:val="16"/>
                 <w:szCs w:val="14"/>
               </w:rPr>
@@ -412,13 +736,15 @@
               <w:jc w:val="right"/>
               <w:rPr>
                 <w:rFonts w:ascii="Gill Sans MT" w:hAnsi="Gill Sans MT"/>
-                <w:sz w:val="16"/>
-                <w:szCs w:val="14"/>
-              </w:rPr>
-            </w:pPr>
-            <w:r>
-              <w:rPr>
-                <w:rFonts w:ascii="Gill Sans MT" w:hAnsi="Gill Sans MT"/>
+                <w:color w:val="808080" w:themeColor="background1" w:themeShade="80"/>
+                <w:sz w:val="16"/>
+                <w:szCs w:val="14"/>
+              </w:rPr>
+            </w:pPr>
+            <w:r>
+              <w:rPr>
+                <w:rFonts w:ascii="Gill Sans MT" w:hAnsi="Gill Sans MT"/>
+                <w:color w:val="808080" w:themeColor="background1" w:themeShade="80"/>
                 <w:sz w:val="16"/>
                 <w:szCs w:val="14"/>
               </w:rPr>
@@ -438,13 +764,19 @@
             </w:tcMar>
           </w:tcPr>
           <w:p>
+            <w:pPr>
+              <w:rPr>
+                <w:sz w:val="22"/>
+                <w:szCs w:val="22"/>
+              </w:rPr>
+            </w:pPr>
             <w:r>
               <w:rPr>
                 <w:rFonts w:ascii="Gill Sans MT" w:hAnsi="Gill Sans MT"/>
                 <w:b/>
                 <w:bCs/>
-                <w:sz w:val="24"/>
-                <w:szCs w:val="24"/>
+                <w:sz w:val="22"/>
+                <w:szCs w:val="22"/>
               </w:rPr>
               <w:t>{</w:t>
             </w:r>
@@ -454,8 +786,8 @@
                 <w:rFonts w:ascii="Gill Sans MT" w:hAnsi="Gill Sans MT"/>
                 <w:b/>
                 <w:bCs/>
-                <w:sz w:val="24"/>
-                <w:szCs w:val="24"/>
+                <w:sz w:val="22"/>
+                <w:szCs w:val="22"/>
               </w:rPr>
               <w:t>abreviacion</w:t>
             </w:r>
@@ -465,8 +797,8 @@
                 <w:rFonts w:ascii="Gill Sans MT" w:hAnsi="Gill Sans MT"/>
                 <w:b/>
                 <w:bCs/>
-                <w:sz w:val="24"/>
-                <w:szCs w:val="24"/>
+                <w:sz w:val="22"/>
+                <w:szCs w:val="22"/>
               </w:rPr>
               <w:t>} {nombre} {</w:t>
             </w:r>
@@ -476,8 +808,8 @@
                 <w:rFonts w:ascii="Gill Sans MT" w:hAnsi="Gill Sans MT"/>
                 <w:b/>
                 <w:bCs/>
-                <w:sz w:val="24"/>
-                <w:szCs w:val="24"/>
+                <w:sz w:val="22"/>
+                <w:szCs w:val="22"/>
               </w:rPr>
               <w:t>apellidoPaterno</w:t>
             </w:r>
@@ -487,8 +819,8 @@
                 <w:rFonts w:ascii="Gill Sans MT" w:hAnsi="Gill Sans MT"/>
                 <w:b/>
                 <w:bCs/>
-                <w:sz w:val="24"/>
-                <w:szCs w:val="24"/>
+                <w:sz w:val="22"/>
+                <w:szCs w:val="22"/>
               </w:rPr>
               <w:t>} {</w:t>
             </w:r>
@@ -498,8 +830,8 @@
                 <w:rFonts w:ascii="Gill Sans MT" w:hAnsi="Gill Sans MT"/>
                 <w:b/>
                 <w:bCs/>
-                <w:sz w:val="24"/>
-                <w:szCs w:val="24"/>
+                <w:sz w:val="22"/>
+                <w:szCs w:val="22"/>
               </w:rPr>
               <w:t>apellidoMaterno</w:t>
             </w:r>
@@ -509,48 +841,48 @@
                 <w:rFonts w:ascii="Gill Sans MT" w:hAnsi="Gill Sans MT"/>
                 <w:b/>
                 <w:bCs/>
-                <w:sz w:val="24"/>
-                <w:szCs w:val="24"/>
+                <w:sz w:val="22"/>
+                <w:szCs w:val="22"/>
               </w:rPr>
               <w:t>}</w:t>
             </w:r>
             <w:r>
               <w:rPr>
                 <w:rFonts w:ascii="Gill Sans MT" w:hAnsi="Gill Sans MT"/>
-                <w:sz w:val="24"/>
-                <w:szCs w:val="24"/>
+                <w:sz w:val="22"/>
+                <w:szCs w:val="22"/>
               </w:rPr>
               <w:br/>
               <w:t xml:space="preserve"> {puesto}</w:t>
             </w:r>
             <w:r>
+              <w:rPr>
+                <w:sz w:val="22"/>
+                <w:szCs w:val="22"/>
+              </w:rPr>
               <w:br/>
             </w:r>
             <w:r>
               <w:rPr>
                 <w:rFonts w:ascii="Gill Sans MT" w:hAnsi="Gill Sans MT"/>
-                <w:sz w:val="24"/>
-                <w:szCs w:val="24"/>
-              </w:rPr>
-              <w:t xml:space="preserve"> C</w:t>
-            </w:r>
-            <w:r>
-              <w:rPr>
-                <w:rFonts w:ascii="Gill Sans MT" w:hAnsi="Gill Sans MT"/>
-                <w:sz w:val="24"/>
-                <w:szCs w:val="24"/>
-              </w:rPr>
-              <w:t>ontraloría General de la Universidad Veracruzana</w:t>
-            </w:r>
-            <w:r>
+                <w:sz w:val="22"/>
+                <w:szCs w:val="22"/>
+              </w:rPr>
+              <w:t xml:space="preserve"> Contraloría General de la Universidad Veracruzana</w:t>
+            </w:r>
+            <w:r>
+              <w:rPr>
+                <w:sz w:val="22"/>
+                <w:szCs w:val="22"/>
+              </w:rPr>
               <w:br/>
               <w:t xml:space="preserve"> </w:t>
             </w:r>
             <w:r>
               <w:rPr>
                 <w:rFonts w:ascii="Gill Sans MT" w:hAnsi="Gill Sans MT"/>
-                <w:sz w:val="24"/>
-                <w:szCs w:val="24"/>
+                <w:sz w:val="22"/>
+                <w:szCs w:val="22"/>
               </w:rPr>
               <w:t>P r e s e n t e.</w:t>
             </w:r>
@@ -560,8 +892,8 @@
               <w:spacing w:before="200" w:after="200"/>
               <w:rPr>
                 <w:rFonts w:ascii="Gill Sans MT" w:hAnsi="Gill Sans MT"/>
-                <w:sz w:val="24"/>
-                <w:szCs w:val="24"/>
+                <w:sz w:val="22"/>
+                <w:szCs w:val="22"/>
               </w:rPr>
             </w:pPr>
             <w:r>
@@ -569,8 +901,8 @@
                 <w:rFonts w:ascii="Gill Sans MT" w:hAnsi="Gill Sans MT"/>
                 <w:i/>
                 <w:iCs/>
-                <w:sz w:val="24"/>
-                <w:szCs w:val="24"/>
+                <w:sz w:val="22"/>
+                <w:szCs w:val="22"/>
               </w:rPr>
               <w:t>Apreciable {</w:t>
             </w:r>
@@ -580,8 +912,8 @@
                 <w:rFonts w:ascii="Gill Sans MT" w:hAnsi="Gill Sans MT"/>
                 <w:i/>
                 <w:iCs/>
-                <w:sz w:val="24"/>
-                <w:szCs w:val="24"/>
+                <w:sz w:val="22"/>
+                <w:szCs w:val="22"/>
               </w:rPr>
               <w:t>ocupacion</w:t>
             </w:r>
@@ -591,8 +923,8 @@
                 <w:rFonts w:ascii="Gill Sans MT" w:hAnsi="Gill Sans MT"/>
                 <w:i/>
                 <w:iCs/>
-                <w:sz w:val="24"/>
-                <w:szCs w:val="24"/>
+                <w:sz w:val="22"/>
+                <w:szCs w:val="22"/>
               </w:rPr>
               <w:t>} {</w:t>
             </w:r>
@@ -602,8 +934,8 @@
                 <w:rFonts w:ascii="Gill Sans MT" w:hAnsi="Gill Sans MT"/>
                 <w:i/>
                 <w:iCs/>
-                <w:sz w:val="24"/>
-                <w:szCs w:val="24"/>
+                <w:sz w:val="22"/>
+                <w:szCs w:val="22"/>
               </w:rPr>
               <w:t>apellidoPaterno</w:t>
             </w:r>
@@ -613,8 +945,8 @@
                 <w:rFonts w:ascii="Gill Sans MT" w:hAnsi="Gill Sans MT"/>
                 <w:i/>
                 <w:iCs/>
-                <w:sz w:val="24"/>
-                <w:szCs w:val="24"/>
+                <w:sz w:val="22"/>
+                <w:szCs w:val="22"/>
               </w:rPr>
               <w:t>} {</w:t>
             </w:r>
@@ -624,8 +956,8 @@
                 <w:rFonts w:ascii="Gill Sans MT" w:hAnsi="Gill Sans MT"/>
                 <w:i/>
                 <w:iCs/>
-                <w:sz w:val="24"/>
-                <w:szCs w:val="24"/>
+                <w:sz w:val="22"/>
+                <w:szCs w:val="22"/>
               </w:rPr>
               <w:t>apellidoMaterno</w:t>
             </w:r>
@@ -635,8 +967,8 @@
                 <w:rFonts w:ascii="Gill Sans MT" w:hAnsi="Gill Sans MT"/>
                 <w:i/>
                 <w:iCs/>
-                <w:sz w:val="24"/>
-                <w:szCs w:val="24"/>
+                <w:sz w:val="22"/>
+                <w:szCs w:val="22"/>
               </w:rPr>
               <w:t>},</w:t>
             </w:r>
@@ -647,51 +979,33 @@
               <w:jc w:val="both"/>
               <w:rPr>
                 <w:rFonts w:ascii="Gill Sans MT" w:hAnsi="Gill Sans MT"/>
-                <w:sz w:val="24"/>
-                <w:szCs w:val="24"/>
-              </w:rPr>
-            </w:pPr>
-            <w:r>
-              <w:rPr>
-                <w:rFonts w:ascii="Gill Sans MT" w:hAnsi="Gill Sans MT"/>
-                <w:sz w:val="24"/>
-                <w:szCs w:val="24"/>
-              </w:rPr>
-              <w:t xml:space="preserve">Con fundamento en lo dispuesto por los artículos 34-B, y 34-C, fracción XI, de la Ley Orgánica de la Universidad Veracruzana; 4, </w:t>
-            </w:r>
-            <w:r>
-              <w:rPr>
-                <w:rFonts w:ascii="Gill Sans MT" w:hAnsi="Gill Sans MT"/>
-                <w:sz w:val="24"/>
-                <w:szCs w:val="24"/>
-              </w:rPr>
-              <w:t xml:space="preserve">fracción X, 14, 15, y 17, fracciones IV y XIV, 336, fracción XXIII, del Estatuto General de la Universidad Veracruzana; y en atención al </w:t>
+                <w:sz w:val="22"/>
+                <w:szCs w:val="22"/>
+              </w:rPr>
+            </w:pPr>
+            <w:r>
+              <w:rPr>
+                <w:rFonts w:ascii="Gill Sans MT" w:hAnsi="Gill Sans MT"/>
+                <w:sz w:val="22"/>
+                <w:szCs w:val="22"/>
+              </w:rPr>
+              <w:t xml:space="preserve">Con fundamento en lo dispuesto por los artículos 34-B, y 34-C, fracción XI, de la Ley Orgánica de la Universidad Veracruzana; 4, fracción X, 14, 15, y 17, fracciones IV y XIV, 336, fracción XXIII, del Estatuto General de la Universidad Veracruzana; y en atención al </w:t>
             </w:r>
             <w:r>
               <w:rPr>
                 <w:rFonts w:ascii="Gill Sans MT" w:hAnsi="Gill Sans MT"/>
                 <w:i/>
                 <w:iCs/>
-                <w:sz w:val="24"/>
-                <w:szCs w:val="24"/>
-              </w:rPr>
-              <w:t>“Acuerdo mediante el cual se instruye a las áreas de la Contraloría General para atender las solicitudes de acceso a la</w:t>
-            </w:r>
-            <w:r>
-              <w:rPr>
-                <w:rFonts w:ascii="Gill Sans MT" w:hAnsi="Gill Sans MT"/>
-                <w:i/>
-                <w:iCs/>
-                <w:sz w:val="24"/>
-                <w:szCs w:val="24"/>
-              </w:rPr>
-              <w:t xml:space="preserve"> información, dentro del ámbito de su competencia”</w:t>
-            </w:r>
-            <w:r>
-              <w:rPr>
-                <w:rFonts w:ascii="Gill Sans MT" w:hAnsi="Gill Sans MT"/>
-                <w:sz w:val="24"/>
-                <w:szCs w:val="24"/>
+                <w:sz w:val="22"/>
+                <w:szCs w:val="22"/>
+              </w:rPr>
+              <w:t>“Acuerdo mediante el cual se instruye a las áreas de la Contraloría General para atender las solicitudes de acceso a la información, dentro del ámbito de su competencia”</w:t>
+            </w:r>
+            <w:r>
+              <w:rPr>
+                <w:rFonts w:ascii="Gill Sans MT" w:hAnsi="Gill Sans MT"/>
+                <w:sz w:val="22"/>
+                <w:szCs w:val="22"/>
               </w:rPr>
               <w:t>, de fecha {</w:t>
             </w:r>
@@ -699,8 +1013,8 @@
             <w:r>
               <w:rPr>
                 <w:rFonts w:ascii="Gill Sans MT" w:hAnsi="Gill Sans MT"/>
-                <w:sz w:val="24"/>
-                <w:szCs w:val="24"/>
+                <w:sz w:val="22"/>
+                <w:szCs w:val="22"/>
               </w:rPr>
               <w:t>fechaReferencia</w:t>
             </w:r>
@@ -708,8 +1022,8 @@
             <w:r>
               <w:rPr>
                 <w:rFonts w:ascii="Gill Sans MT" w:hAnsi="Gill Sans MT"/>
-                <w:sz w:val="24"/>
-                <w:szCs w:val="24"/>
+                <w:sz w:val="22"/>
+                <w:szCs w:val="22"/>
               </w:rPr>
               <w:t>}, me permito remitir a usted la solicitud de información recibida el {</w:t>
             </w:r>
@@ -717,8 +1031,8 @@
             <w:r>
               <w:rPr>
                 <w:rFonts w:ascii="Gill Sans MT" w:hAnsi="Gill Sans MT"/>
-                <w:sz w:val="24"/>
-                <w:szCs w:val="24"/>
+                <w:sz w:val="22"/>
+                <w:szCs w:val="22"/>
               </w:rPr>
               <w:t>fechaHoyLong</w:t>
             </w:r>
@@ -726,25 +1040,17 @@
             <w:r>
               <w:rPr>
                 <w:rFonts w:ascii="Gill Sans MT" w:hAnsi="Gill Sans MT"/>
-                <w:sz w:val="24"/>
-                <w:szCs w:val="24"/>
-              </w:rPr>
-              <w:t>}, a través de la Plataforma Nacional de Transparencia, registrada con el número de folio {folio</w:t>
-            </w:r>
-            <w:r>
-              <w:rPr>
-                <w:rFonts w:ascii="Gill Sans MT" w:hAnsi="Gill Sans MT"/>
-                <w:sz w:val="24"/>
-                <w:szCs w:val="24"/>
-              </w:rPr>
-              <w:t>}, que se adjunta, la cual tiene como fecha de vencimiento para su atención el día {</w:t>
+                <w:sz w:val="22"/>
+                <w:szCs w:val="22"/>
+              </w:rPr>
+              <w:t>}, a través de la Plataforma Nacional de Transparencia, registrada con el número de folio {folio}, que se adjunta, la cual tiene como fecha de vencimiento para su atención el día {</w:t>
             </w:r>
             <w:proofErr w:type="spellStart"/>
             <w:r>
               <w:rPr>
                 <w:rFonts w:ascii="Gill Sans MT" w:hAnsi="Gill Sans MT"/>
-                <w:sz w:val="24"/>
-                <w:szCs w:val="24"/>
+                <w:sz w:val="22"/>
+                <w:szCs w:val="22"/>
               </w:rPr>
               <w:t>fechaMaxima</w:t>
             </w:r>
@@ -752,8 +1058,8 @@
             <w:r>
               <w:rPr>
                 <w:rFonts w:ascii="Gill Sans MT" w:hAnsi="Gill Sans MT"/>
-                <w:sz w:val="24"/>
-                <w:szCs w:val="24"/>
+                <w:sz w:val="22"/>
+                <w:szCs w:val="22"/>
               </w:rPr>
               <w:t>}.</w:t>
             </w:r>
@@ -764,33 +1070,17 @@
               <w:jc w:val="both"/>
               <w:rPr>
                 <w:rFonts w:ascii="Gill Sans MT" w:hAnsi="Gill Sans MT"/>
-                <w:sz w:val="24"/>
-                <w:szCs w:val="24"/>
-              </w:rPr>
-            </w:pPr>
-            <w:r>
-              <w:rPr>
-                <w:rFonts w:ascii="Gill Sans MT" w:hAnsi="Gill Sans MT"/>
-                <w:sz w:val="24"/>
-                <w:szCs w:val="24"/>
-              </w:rPr>
-              <w:t>Lo anterior, con la finalidad de que, en el ámbito de su competencia, se lleve a cabo el análisis respectivo y se otorgue la respuesta que corresponda, confor</w:t>
-            </w:r>
-            <w:r>
-              <w:rPr>
-                <w:rFonts w:ascii="Gill Sans MT" w:hAnsi="Gill Sans MT"/>
-                <w:sz w:val="24"/>
-                <w:szCs w:val="24"/>
-              </w:rPr>
-              <w:t>me a los plazos establecidos en el artículo 116 de la Ley Número 250 de Transparencia y Acceso a la Información Pública del Estado de Veracruz de Ignacio de la Llave, a través de los medios establecidos por la Coordinación Universitaria de Transparencia, A</w:t>
-            </w:r>
-            <w:r>
-              <w:rPr>
-                <w:rFonts w:ascii="Gill Sans MT" w:hAnsi="Gill Sans MT"/>
-                <w:sz w:val="24"/>
-                <w:szCs w:val="24"/>
-              </w:rPr>
-              <w:t>cceso a la Información y Protección de Datos Personales (CUTAI).</w:t>
+                <w:sz w:val="22"/>
+                <w:szCs w:val="22"/>
+              </w:rPr>
+            </w:pPr>
+            <w:r>
+              <w:rPr>
+                <w:rFonts w:ascii="Gill Sans MT" w:hAnsi="Gill Sans MT"/>
+                <w:sz w:val="22"/>
+                <w:szCs w:val="22"/>
+              </w:rPr>
+              <w:t>Lo anterior, con la finalidad de que, en el ámbito de su competencia, se lleve a cabo el análisis respectivo y se otorgue la respuesta que corresponda, conforme a los plazos establecidos en el artículo 116 de la Ley Número 250 de Transparencia y Acceso a la Información Pública del Estado de Veracruz de Ignacio de la Llave, a través de los medios establecidos por la Coordinación Universitaria de Transparencia, Acceso a la Información y Protección de Datos Personales (CUTAI).</w:t>
             </w:r>
           </w:p>
           <w:p>
@@ -799,15 +1089,15 @@
               <w:jc w:val="both"/>
               <w:rPr>
                 <w:rFonts w:ascii="Gill Sans MT" w:hAnsi="Gill Sans MT"/>
-                <w:sz w:val="24"/>
-                <w:szCs w:val="24"/>
-              </w:rPr>
-            </w:pPr>
-            <w:r>
-              <w:rPr>
-                <w:rFonts w:ascii="Gill Sans MT" w:hAnsi="Gill Sans MT"/>
-                <w:sz w:val="24"/>
-                <w:szCs w:val="24"/>
+                <w:sz w:val="22"/>
+                <w:szCs w:val="22"/>
+              </w:rPr>
+            </w:pPr>
+            <w:r>
+              <w:rPr>
+                <w:rFonts w:ascii="Gill Sans MT" w:hAnsi="Gill Sans MT"/>
+                <w:sz w:val="22"/>
+                <w:szCs w:val="22"/>
               </w:rPr>
               <w:t>Sin otro particular, hago propicia la ocasión para enviarle un cordial saludo.</w:t>
             </w:r>
@@ -817,8 +1107,8 @@
               <w:jc w:val="center"/>
               <w:rPr>
                 <w:rFonts w:ascii="Gill Sans MT" w:hAnsi="Gill Sans MT"/>
-                <w:sz w:val="24"/>
-                <w:szCs w:val="24"/>
+                <w:sz w:val="22"/>
+                <w:szCs w:val="22"/>
               </w:rPr>
             </w:pPr>
             <w:r>
@@ -826,16 +1116,16 @@
                 <w:rFonts w:ascii="Gill Sans MT" w:hAnsi="Gill Sans MT"/>
                 <w:b/>
                 <w:bCs/>
-                <w:sz w:val="24"/>
-                <w:szCs w:val="24"/>
+                <w:sz w:val="22"/>
+                <w:szCs w:val="22"/>
               </w:rPr>
               <w:t>A T E N T A M E N T E.</w:t>
             </w:r>
             <w:r>
               <w:rPr>
                 <w:rFonts w:ascii="Gill Sans MT" w:hAnsi="Gill Sans MT"/>
-                <w:sz w:val="24"/>
-                <w:szCs w:val="24"/>
+                <w:sz w:val="22"/>
+                <w:szCs w:val="22"/>
               </w:rPr>
               <w:br/>
               <w:t xml:space="preserve"> “Lis de Veracruz: Arte, Ciencia, Luz”</w:t>
@@ -843,8 +1133,8 @@
             <w:r>
               <w:rPr>
                 <w:rFonts w:ascii="Gill Sans MT" w:hAnsi="Gill Sans MT"/>
-                <w:sz w:val="24"/>
-                <w:szCs w:val="24"/>
+                <w:sz w:val="22"/>
+                <w:szCs w:val="22"/>
               </w:rPr>
               <w:br/>
               <w:t xml:space="preserve"> Xalapa, Ver., a {</w:t>
@@ -853,8 +1143,8 @@
             <w:r>
               <w:rPr>
                 <w:rFonts w:ascii="Gill Sans MT" w:hAnsi="Gill Sans MT"/>
-                <w:sz w:val="24"/>
-                <w:szCs w:val="24"/>
+                <w:sz w:val="22"/>
+                <w:szCs w:val="22"/>
               </w:rPr>
               <w:t>fechaHoyLong</w:t>
             </w:r>
@@ -862,8 +1152,8 @@
             <w:r>
               <w:rPr>
                 <w:rFonts w:ascii="Gill Sans MT" w:hAnsi="Gill Sans MT"/>
-                <w:sz w:val="24"/>
-                <w:szCs w:val="24"/>
+                <w:sz w:val="22"/>
+                <w:szCs w:val="22"/>
               </w:rPr>
               <w:t>}</w:t>
             </w:r>
@@ -874,8 +1164,8 @@
               <w:jc w:val="center"/>
               <w:rPr>
                 <w:rFonts w:ascii="Gill Sans MT" w:hAnsi="Gill Sans MT"/>
-                <w:sz w:val="24"/>
-                <w:szCs w:val="24"/>
+                <w:sz w:val="22"/>
+                <w:szCs w:val="22"/>
               </w:rPr>
             </w:pPr>
             <w:r>
@@ -883,26 +1173,16 @@
                 <w:rFonts w:ascii="Gill Sans MT" w:hAnsi="Gill Sans MT"/>
                 <w:b/>
                 <w:bCs/>
-                <w:sz w:val="24"/>
-                <w:szCs w:val="24"/>
-              </w:rPr>
-              <w:t>M.A.P. Norma Hilda</w:t>
-            </w:r>
-            <w:r>
-              <w:rPr>
-                <w:rFonts w:ascii="Gill Sans MT" w:hAnsi="Gill Sans MT"/>
-                <w:b/>
-                <w:bCs/>
-                <w:sz w:val="24"/>
-                <w:szCs w:val="24"/>
-              </w:rPr>
-              <w:t xml:space="preserve"> Jiménez Martínez</w:t>
-            </w:r>
-            <w:r>
-              <w:rPr>
-                <w:rFonts w:ascii="Gill Sans MT" w:hAnsi="Gill Sans MT"/>
-                <w:sz w:val="24"/>
-                <w:szCs w:val="24"/>
+                <w:sz w:val="22"/>
+                <w:szCs w:val="22"/>
+              </w:rPr>
+              <w:t>M.A.P. Norma Hilda Jiménez Martínez</w:t>
+            </w:r>
+            <w:r>
+              <w:rPr>
+                <w:rFonts w:ascii="Gill Sans MT" w:hAnsi="Gill Sans MT"/>
+                <w:sz w:val="22"/>
+                <w:szCs w:val="22"/>
               </w:rPr>
               <w:br/>
               <w:t xml:space="preserve"> Contralora General</w:t>
@@ -946,6 +1226,44 @@
     </w:sectPr>
   </w:body>
 </w:document>
+</file>
+
+<file path=word/endnotes.xml><?xml version="1.0" encoding="utf-8"?>
+<w:endnotes xmlns:wpc="http://schemas.microsoft.com/office/word/2010/wordprocessingCanvas" xmlns:cx="http://schemas.microsoft.com/office/drawing/2014/chartex" xmlns:cx1="http://schemas.microsoft.com/office/drawing/2015/9/8/chartex" xmlns:cx2="http://schemas.microsoft.com/office/drawing/2015/10/21/chartex" xmlns:cx3="http://schemas.microsoft.com/office/drawing/2016/5/9/chartex" xmlns:cx4="http://schemas.microsoft.com/office/drawing/2016/5/10/chartex" xmlns:cx5="http://schemas.microsoft.com/office/drawing/2016/5/11/chartex" xmlns:cx6="http://schemas.microsoft.com/office/drawing/2016/5/12/chartex" xmlns:cx7="http://schemas.microsoft.com/office/drawing/2016/5/13/chartex" xmlns:cx8="http://schemas.microsoft.com/office/drawing/2016/5/14/chartex" xmlns:mc="http://schemas.openxmlformats.org/markup-compatibility/2006" xmlns:aink="http://schemas.microsoft.com/office/drawing/2016/ink" xmlns:am3d="http://schemas.microsoft.com/office/drawing/2017/model3d" xmlns:o="urn:schemas-microsoft-com:office:office" xmlns:r="http://schemas.openxmlformats.org/officeDocument/2006/relationships" xmlns:m="http://schemas.openxmlformats.org/officeDocument/2006/math" xmlns:v="urn:schemas-microsoft-com:vml" xmlns:wp14="http://schemas.microsoft.com/office/word/2010/wordprocessingDrawing" xmlns:wp="http://schemas.openxmlformats.org/drawingml/2006/wordprocessingDrawing" xmlns:w10="urn:schemas-microsoft-com:office:word" xmlns:w="http://schemas.openxmlformats.org/wordprocessingml/2006/main" xmlns:w14="http://schemas.microsoft.com/office/word/2010/wordml" xmlns:w15="http://schemas.microsoft.com/office/word/2012/wordml" xmlns:w16cex="http://schemas.microsoft.com/office/word/2018/wordml/cex" xmlns:w16cid="http://schemas.microsoft.com/office/word/2016/wordml/cid" xmlns:w16="http://schemas.microsoft.com/office/word/2018/wordml" xmlns:w16sdtdh="http://schemas.microsoft.com/office/word/2020/wordml/sdtdatahash" xmlns:w16se="http://schemas.microsoft.com/office/word/2015/wordml/symex" xmlns:wpg="http://schemas.microsoft.com/office/word/2010/wordprocessingGroup" xmlns:wpi="http://schemas.microsoft.com/office/word/2010/wordprocessingInk" xmlns:wne="http://schemas.microsoft.com/office/word/2006/wordml" xmlns:wps="http://schemas.microsoft.com/office/word/2010/wordprocessingShape" mc:Ignorable="w14 w15 w16se w16cid w16 w16cex w16sdtdh wp14">
+  <w:endnote w:type="separator" w:id="-1">
+    <w:p>
+      <w:r>
+        <w:separator/>
+      </w:r>
+    </w:p>
+  </w:endnote>
+  <w:endnote w:type="continuationSeparator" w:id="0">
+    <w:p>
+      <w:r>
+        <w:continuationSeparator/>
+      </w:r>
+    </w:p>
+  </w:endnote>
+</w:endnotes>
+</file>
+
+<file path=word/footnotes.xml><?xml version="1.0" encoding="utf-8"?>
+<w:footnotes xmlns:wpc="http://schemas.microsoft.com/office/word/2010/wordprocessingCanvas" xmlns:cx="http://schemas.microsoft.com/office/drawing/2014/chartex" xmlns:cx1="http://schemas.microsoft.com/office/drawing/2015/9/8/chartex" xmlns:cx2="http://schemas.microsoft.com/office/drawing/2015/10/21/chartex" xmlns:cx3="http://schemas.microsoft.com/office/drawing/2016/5/9/chartex" xmlns:cx4="http://schemas.microsoft.com/office/drawing/2016/5/10/chartex" xmlns:cx5="http://schemas.microsoft.com/office/drawing/2016/5/11/chartex" xmlns:cx6="http://schemas.microsoft.com/office/drawing/2016/5/12/chartex" xmlns:cx7="http://schemas.microsoft.com/office/drawing/2016/5/13/chartex" xmlns:cx8="http://schemas.microsoft.com/office/drawing/2016/5/14/chartex" xmlns:mc="http://schemas.openxmlformats.org/markup-compatibility/2006" xmlns:aink="http://schemas.microsoft.com/office/drawing/2016/ink" xmlns:am3d="http://schemas.microsoft.com/office/drawing/2017/model3d" xmlns:o="urn:schemas-microsoft-com:office:office" xmlns:r="http://schemas.openxmlformats.org/officeDocument/2006/relationships" xmlns:m="http://schemas.openxmlformats.org/officeDocument/2006/math" xmlns:v="urn:schemas-microsoft-com:vml" xmlns:wp14="http://schemas.microsoft.com/office/word/2010/wordprocessingDrawing" xmlns:wp="http://schemas.openxmlformats.org/drawingml/2006/wordprocessingDrawing" xmlns:w10="urn:schemas-microsoft-com:office:word" xmlns:w="http://schemas.openxmlformats.org/wordprocessingml/2006/main" xmlns:w14="http://schemas.microsoft.com/office/word/2010/wordml" xmlns:w15="http://schemas.microsoft.com/office/word/2012/wordml" xmlns:w16cex="http://schemas.microsoft.com/office/word/2018/wordml/cex" xmlns:w16cid="http://schemas.microsoft.com/office/word/2016/wordml/cid" xmlns:w16="http://schemas.microsoft.com/office/word/2018/wordml" xmlns:w16sdtdh="http://schemas.microsoft.com/office/word/2020/wordml/sdtdatahash" xmlns:w16se="http://schemas.microsoft.com/office/word/2015/wordml/symex" xmlns:wpg="http://schemas.microsoft.com/office/word/2010/wordprocessingGroup" xmlns:wpi="http://schemas.microsoft.com/office/word/2010/wordprocessingInk" xmlns:wne="http://schemas.microsoft.com/office/word/2006/wordml" xmlns:wps="http://schemas.microsoft.com/office/word/2010/wordprocessingShape" mc:Ignorable="w14 w15 w16se w16cid w16 w16cex w16sdtdh wp14">
+  <w:footnote w:type="separator" w:id="-1">
+    <w:p>
+      <w:r>
+        <w:separator/>
+      </w:r>
+    </w:p>
+  </w:footnote>
+  <w:footnote w:type="continuationSeparator" w:id="0">
+    <w:p>
+      <w:r>
+        <w:continuationSeparator/>
+      </w:r>
+    </w:p>
+  </w:footnote>
+</w:footnotes>
 </file>
 
 <file path=word/numbering.xml><?xml version="1.0" encoding="utf-8"?>
@@ -1633,6 +1951,48 @@
       <w:szCs w:val="20"/>
     </w:rPr>
   </w:style>
+  <w:style w:type="paragraph" w:styleId="Encabezado">
+    <w:name w:val="header"/>
+    <w:basedOn w:val="Normal"/>
+    <w:link w:val="EncabezadoCar"/>
+    <w:uiPriority w:val="99"/>
+    <w:unhideWhenUsed/>
+    <w:rsid w:val="00DD1D78"/>
+    <w:pPr>
+      <w:tabs>
+        <w:tab w:val="center" w:pos="4419"/>
+        <w:tab w:val="right" w:pos="8838"/>
+      </w:tabs>
+    </w:pPr>
+  </w:style>
+  <w:style w:type="character" w:customStyle="1" w:styleId="EncabezadoCar">
+    <w:name w:val="Encabezado Car"/>
+    <w:basedOn w:val="Fuentedeprrafopredeter"/>
+    <w:link w:val="Encabezado"/>
+    <w:uiPriority w:val="99"/>
+    <w:rsid w:val="00DD1D78"/>
+  </w:style>
+  <w:style w:type="paragraph" w:styleId="Piedepgina">
+    <w:name w:val="footer"/>
+    <w:basedOn w:val="Normal"/>
+    <w:link w:val="PiedepginaCar"/>
+    <w:uiPriority w:val="99"/>
+    <w:unhideWhenUsed/>
+    <w:rsid w:val="00DD1D78"/>
+    <w:pPr>
+      <w:tabs>
+        <w:tab w:val="center" w:pos="4419"/>
+        <w:tab w:val="right" w:pos="8838"/>
+      </w:tabs>
+    </w:pPr>
+  </w:style>
+  <w:style w:type="character" w:customStyle="1" w:styleId="PiedepginaCar">
+    <w:name w:val="Pie de página Car"/>
+    <w:basedOn w:val="Fuentedeprrafopredeter"/>
+    <w:link w:val="Piedepgina"/>
+    <w:uiPriority w:val="99"/>
+    <w:rsid w:val="00DD1D78"/>
+  </w:style>
 </w:styles>
 </file>
 

</xml_diff>

<commit_message>
Versión estable con pruebas de SGPC
</commit_message>
<xml_diff>
--- a/backend/templates/Plantilla Oficio Solicitud Transparencia.docx
+++ b/backend/templates/Plantilla Oficio Solicitud Transparencia.docx
@@ -293,6 +293,8 @@
         <w:jc w:val="right"/>
         <w:rPr>
           <w:rFonts w:ascii="Gill Sans MT" w:hAnsi="Gill Sans MT"/>
+          <w:sz w:val="21"/>
+          <w:szCs w:val="21"/>
         </w:rPr>
       </w:pPr>
       <w:r>
@@ -301,6 +303,14 @@
           <w:bCs/>
         </w:rPr>
         <w:br/>
+      </w:r>
+      <w:r>
+        <w:rPr>
+          <w:b/>
+          <w:bCs/>
+          <w:sz w:val="22"/>
+          <w:szCs w:val="22"/>
+        </w:rPr>
         <w:t xml:space="preserve">  </w:t>
       </w:r>
       <w:proofErr w:type="spellStart"/>
@@ -309,6 +319,8 @@
           <w:rFonts w:ascii="Gill Sans MT" w:hAnsi="Gill Sans MT"/>
           <w:b/>
           <w:bCs/>
+          <w:sz w:val="21"/>
+          <w:szCs w:val="21"/>
         </w:rPr>
         <w:t>Of</w:t>
       </w:r>
@@ -318,25 +330,55 @@
           <w:rFonts w:ascii="Gill Sans MT" w:hAnsi="Gill Sans MT"/>
           <w:b/>
           <w:bCs/>
+          <w:sz w:val="21"/>
+          <w:szCs w:val="21"/>
         </w:rPr>
         <w:t xml:space="preserve">. Núm.: </w:t>
       </w:r>
       <w:r>
         <w:rPr>
           <w:rFonts w:ascii="Gill Sans MT" w:hAnsi="Gill Sans MT"/>
+          <w:sz w:val="21"/>
+          <w:szCs w:val="21"/>
         </w:rPr>
-        <w:t>CG {folio}</w:t>
+        <w:t>CG {</w:t>
+      </w:r>
+      <w:proofErr w:type="spellStart"/>
+      <w:r>
+        <w:rPr>
+          <w:rFonts w:ascii="Gill Sans MT" w:hAnsi="Gill Sans MT"/>
+          <w:sz w:val="21"/>
+          <w:szCs w:val="21"/>
+        </w:rPr>
+        <w:t>folio</w:t>
+      </w:r>
+      <w:r>
+        <w:rPr>
+          <w:rFonts w:ascii="Gill Sans MT" w:hAnsi="Gill Sans MT"/>
+          <w:sz w:val="21"/>
+          <w:szCs w:val="21"/>
+        </w:rPr>
+        <w:t>Oficio</w:t>
+      </w:r>
+      <w:proofErr w:type="spellEnd"/>
+      <w:r>
+        <w:rPr>
+          <w:rFonts w:ascii="Gill Sans MT" w:hAnsi="Gill Sans MT"/>
+          <w:sz w:val="21"/>
+          <w:szCs w:val="21"/>
+        </w:rPr>
+        <w:t>}</w:t>
       </w:r>
     </w:p>
     <w:p>
       <w:pPr>
         <w:jc w:val="right"/>
+        <w:rPr>
+          <w:sz w:val="17"/>
+          <w:szCs w:val="17"/>
+        </w:rPr>
       </w:pPr>
       <w:r>
-        <w:rPr>
-          <w:sz w:val="18"/>
-          <w:szCs w:val="18"/>
-        </w:rPr>
         <w:br/>
         <w:t xml:space="preserve"> </w:t>
       </w:r>
@@ -345,35 +387,27 @@
           <w:rFonts w:ascii="Gill Sans MT" w:hAnsi="Gill Sans MT"/>
           <w:b/>
           <w:bCs/>
-          <w:sz w:val="16"/>
-          <w:szCs w:val="16"/>
+          <w:sz w:val="17"/>
+          <w:szCs w:val="17"/>
         </w:rPr>
         <w:t>Asunto:</w:t>
       </w:r>
       <w:r>
         <w:rPr>
           <w:rFonts w:ascii="Gill Sans MT" w:hAnsi="Gill Sans MT"/>
-          <w:sz w:val="16"/>
-          <w:szCs w:val="16"/>
+          <w:sz w:val="17"/>
+          <w:szCs w:val="17"/>
         </w:rPr>
         <w:t xml:space="preserve"> Solicitud de acceso a la</w:t>
       </w:r>
       <w:r>
         <w:rPr>
           <w:rFonts w:ascii="Gill Sans MT" w:hAnsi="Gill Sans MT"/>
-          <w:sz w:val="16"/>
-          <w:szCs w:val="16"/>
+          <w:sz w:val="17"/>
+          <w:szCs w:val="17"/>
         </w:rPr>
         <w:br/>
-        <w:t xml:space="preserve"> información con folio {folio</w:t>
-      </w:r>
-      <w:r>
-        <w:rPr>
-          <w:rFonts w:ascii="Gill Sans MT" w:hAnsi="Gill Sans MT"/>
-          <w:sz w:val="18"/>
-          <w:szCs w:val="18"/>
-        </w:rPr>
-        <w:t>}.</w:t>
+        <w:t xml:space="preserve"> información con folio {folio}.</w:t>
       </w:r>
     </w:p>
     <w:p>
@@ -383,8 +417,8 @@
     </w:p>
     <w:tbl>
       <w:tblPr>
-        <w:tblW w:w="5295" w:type="pct"/>
-        <w:tblInd w:w="-709" w:type="dxa"/>
+        <w:tblW w:w="5300" w:type="pct"/>
+        <w:tblInd w:w="-572" w:type="dxa"/>
         <w:tblCellMar>
           <w:left w:w="10" w:type="dxa"/>
           <w:right w:w="10" w:type="dxa"/>
@@ -392,8 +426,8 @@
         <w:tblLook w:val="04A0" w:firstRow="1" w:lastRow="0" w:firstColumn="1" w:lastColumn="0" w:noHBand="0" w:noVBand="1"/>
       </w:tblPr>
       <w:tblGrid>
-        <w:gridCol w:w="1984"/>
-        <w:gridCol w:w="8223"/>
+        <w:gridCol w:w="1986"/>
+        <w:gridCol w:w="8230"/>
       </w:tblGrid>
       <w:tr>
         <w:tc>
@@ -417,7 +451,10 @@
                 <w:szCs w:val="16"/>
               </w:rPr>
             </w:pPr>
-            <w:r>
+          </w:p>
+          <w:p>
+            <w:pPr>
+              <w:jc w:val="center"/>
               <w:rPr>
                 <w:rFonts w:ascii="Gill Sans MT" w:hAnsi="Gill Sans MT"/>
                 <w:b/>
@@ -425,6 +462,97 @@
                 <w:sz w:val="16"/>
                 <w:szCs w:val="16"/>
               </w:rPr>
+            </w:pPr>
+          </w:p>
+          <w:p>
+            <w:pPr>
+              <w:jc w:val="center"/>
+              <w:rPr>
+                <w:rFonts w:ascii="Gill Sans MT" w:hAnsi="Gill Sans MT"/>
+                <w:b/>
+                <w:color w:val="404040" w:themeColor="text1" w:themeTint="BF"/>
+                <w:sz w:val="16"/>
+                <w:szCs w:val="16"/>
+              </w:rPr>
+            </w:pPr>
+          </w:p>
+          <w:p>
+            <w:pPr>
+              <w:jc w:val="center"/>
+              <w:rPr>
+                <w:rFonts w:ascii="Gill Sans MT" w:hAnsi="Gill Sans MT"/>
+                <w:b/>
+                <w:color w:val="404040" w:themeColor="text1" w:themeTint="BF"/>
+                <w:sz w:val="16"/>
+                <w:szCs w:val="16"/>
+              </w:rPr>
+            </w:pPr>
+          </w:p>
+          <w:p>
+            <w:pPr>
+              <w:jc w:val="center"/>
+              <w:rPr>
+                <w:rFonts w:ascii="Gill Sans MT" w:hAnsi="Gill Sans MT"/>
+                <w:b/>
+                <w:color w:val="404040" w:themeColor="text1" w:themeTint="BF"/>
+                <w:sz w:val="16"/>
+                <w:szCs w:val="16"/>
+              </w:rPr>
+            </w:pPr>
+          </w:p>
+          <w:p>
+            <w:pPr>
+              <w:jc w:val="center"/>
+              <w:rPr>
+                <w:rFonts w:ascii="Gill Sans MT" w:hAnsi="Gill Sans MT"/>
+                <w:b/>
+                <w:color w:val="404040" w:themeColor="text1" w:themeTint="BF"/>
+                <w:sz w:val="16"/>
+                <w:szCs w:val="16"/>
+              </w:rPr>
+            </w:pPr>
+          </w:p>
+          <w:p>
+            <w:pPr>
+              <w:jc w:val="center"/>
+              <w:rPr>
+                <w:rFonts w:ascii="Gill Sans MT" w:hAnsi="Gill Sans MT"/>
+                <w:b/>
+                <w:color w:val="404040" w:themeColor="text1" w:themeTint="BF"/>
+                <w:sz w:val="16"/>
+                <w:szCs w:val="16"/>
+              </w:rPr>
+            </w:pPr>
+          </w:p>
+          <w:p>
+            <w:pPr>
+              <w:jc w:val="right"/>
+              <w:rPr>
+                <w:rFonts w:ascii="Gill Sans MT" w:hAnsi="Gill Sans MT"/>
+                <w:b/>
+                <w:color w:val="404040" w:themeColor="text1" w:themeTint="BF"/>
+                <w:sz w:val="16"/>
+                <w:szCs w:val="16"/>
+              </w:rPr>
+            </w:pPr>
+            <w:r>
+              <w:rPr>
+                <w:rFonts w:ascii="Gill Sans MT" w:hAnsi="Gill Sans MT"/>
+                <w:b/>
+                <w:color w:val="404040" w:themeColor="text1" w:themeTint="BF"/>
+                <w:sz w:val="16"/>
+                <w:szCs w:val="16"/>
+              </w:rPr>
+              <w:t xml:space="preserve">      </w:t>
+            </w:r>
+            <w:r>
+              <w:rPr>
+                <w:rFonts w:ascii="Gill Sans MT" w:hAnsi="Gill Sans MT"/>
+                <w:b/>
+                <w:color w:val="404040" w:themeColor="text1" w:themeTint="BF"/>
+                <w:sz w:val="16"/>
+                <w:szCs w:val="16"/>
+              </w:rPr>
               <w:t>Contraloría General</w:t>
             </w:r>
           </w:p>
@@ -434,8 +562,8 @@
               <w:rPr>
                 <w:rFonts w:ascii="Gill Sans MT" w:hAnsi="Gill Sans MT"/>
                 <w:color w:val="404040" w:themeColor="text1" w:themeTint="BF"/>
-                <w:sz w:val="18"/>
-                <w:szCs w:val="12"/>
+                <w:sz w:val="16"/>
+                <w:szCs w:val="16"/>
               </w:rPr>
             </w:pPr>
           </w:p>
@@ -446,6 +574,283 @@
                 <w:rFonts w:ascii="Gill Sans MT" w:hAnsi="Gill Sans MT"/>
                 <w:color w:val="404040" w:themeColor="text1" w:themeTint="BF"/>
                 <w:sz w:val="16"/>
+                <w:szCs w:val="16"/>
+              </w:rPr>
+            </w:pPr>
+            <w:r>
+              <w:rPr>
+                <w:rFonts w:ascii="Gill Sans MT" w:hAnsi="Gill Sans MT"/>
+                <w:color w:val="404040" w:themeColor="text1" w:themeTint="BF"/>
+                <w:sz w:val="16"/>
+                <w:szCs w:val="16"/>
+              </w:rPr>
+              <w:t>Murillo Vidal Núm. 250</w:t>
+            </w:r>
+          </w:p>
+          <w:p>
+            <w:pPr>
+              <w:jc w:val="right"/>
+              <w:rPr>
+                <w:rFonts w:ascii="Gill Sans MT" w:hAnsi="Gill Sans MT"/>
+                <w:color w:val="404040" w:themeColor="text1" w:themeTint="BF"/>
+                <w:sz w:val="16"/>
+                <w:szCs w:val="16"/>
+              </w:rPr>
+            </w:pPr>
+            <w:r>
+              <w:rPr>
+                <w:rFonts w:ascii="Gill Sans MT" w:hAnsi="Gill Sans MT"/>
+                <w:color w:val="404040" w:themeColor="text1" w:themeTint="BF"/>
+                <w:sz w:val="16"/>
+                <w:szCs w:val="16"/>
+              </w:rPr>
+              <w:t>Col. Cuauhtémoc</w:t>
+            </w:r>
+          </w:p>
+          <w:p>
+            <w:pPr>
+              <w:jc w:val="right"/>
+              <w:rPr>
+                <w:rFonts w:ascii="Gill Sans MT" w:hAnsi="Gill Sans MT"/>
+                <w:color w:val="404040" w:themeColor="text1" w:themeTint="BF"/>
+                <w:sz w:val="16"/>
+                <w:szCs w:val="16"/>
+              </w:rPr>
+            </w:pPr>
+            <w:r>
+              <w:rPr>
+                <w:rFonts w:ascii="Gill Sans MT" w:hAnsi="Gill Sans MT"/>
+                <w:color w:val="404040" w:themeColor="text1" w:themeTint="BF"/>
+                <w:sz w:val="16"/>
+                <w:szCs w:val="16"/>
+              </w:rPr>
+              <w:t>{</w:t>
+            </w:r>
+            <w:proofErr w:type="spellStart"/>
+            <w:r>
+              <w:rPr>
+                <w:rFonts w:ascii="Gill Sans MT" w:hAnsi="Gill Sans MT"/>
+                <w:color w:val="404040" w:themeColor="text1" w:themeTint="BF"/>
+                <w:sz w:val="16"/>
+                <w:szCs w:val="16"/>
+              </w:rPr>
+              <w:t>abreviacion</w:t>
+            </w:r>
+            <w:proofErr w:type="spellEnd"/>
+            <w:r>
+              <w:rPr>
+                <w:rFonts w:ascii="Gill Sans MT" w:hAnsi="Gill Sans MT"/>
+                <w:color w:val="404040" w:themeColor="text1" w:themeTint="BF"/>
+                <w:sz w:val="16"/>
+                <w:szCs w:val="16"/>
+              </w:rPr>
+              <w:t>} 91069</w:t>
+            </w:r>
+          </w:p>
+          <w:p>
+            <w:pPr>
+              <w:jc w:val="right"/>
+              <w:rPr>
+                <w:rFonts w:ascii="Gill Sans MT" w:hAnsi="Gill Sans MT"/>
+                <w:color w:val="404040" w:themeColor="text1" w:themeTint="BF"/>
+                <w:sz w:val="16"/>
+                <w:szCs w:val="16"/>
+              </w:rPr>
+            </w:pPr>
+            <w:r>
+              <w:rPr>
+                <w:rFonts w:ascii="Gill Sans MT" w:hAnsi="Gill Sans MT"/>
+                <w:color w:val="404040" w:themeColor="text1" w:themeTint="BF"/>
+                <w:sz w:val="16"/>
+                <w:szCs w:val="16"/>
+              </w:rPr>
+              <w:t>Xalapa, Ver.</w:t>
+            </w:r>
+          </w:p>
+          <w:p>
+            <w:pPr>
+              <w:jc w:val="right"/>
+              <w:rPr>
+                <w:rFonts w:ascii="Gill Sans MT" w:hAnsi="Gill Sans MT"/>
+                <w:color w:val="404040" w:themeColor="text1" w:themeTint="BF"/>
+                <w:sz w:val="16"/>
+                <w:szCs w:val="16"/>
+              </w:rPr>
+            </w:pPr>
+            <w:r>
+              <w:rPr>
+                <w:rFonts w:ascii="Gill Sans MT" w:hAnsi="Gill Sans MT"/>
+                <w:color w:val="404040" w:themeColor="text1" w:themeTint="BF"/>
+                <w:sz w:val="16"/>
+                <w:szCs w:val="16"/>
+              </w:rPr>
+              <w:t>México</w:t>
+            </w:r>
+          </w:p>
+          <w:p>
+            <w:pPr>
+              <w:jc w:val="right"/>
+              <w:rPr>
+                <w:rFonts w:ascii="Gill Sans MT" w:hAnsi="Gill Sans MT"/>
+                <w:color w:val="404040" w:themeColor="text1" w:themeTint="BF"/>
+                <w:sz w:val="16"/>
+                <w:szCs w:val="16"/>
+              </w:rPr>
+            </w:pPr>
+          </w:p>
+          <w:p>
+            <w:pPr>
+              <w:jc w:val="right"/>
+              <w:rPr>
+                <w:rFonts w:ascii="Gill Sans MT" w:hAnsi="Gill Sans MT"/>
+                <w:b/>
+                <w:color w:val="404040" w:themeColor="text1" w:themeTint="BF"/>
+                <w:sz w:val="16"/>
+                <w:szCs w:val="16"/>
+              </w:rPr>
+            </w:pPr>
+            <w:r>
+              <w:rPr>
+                <w:rFonts w:ascii="Gill Sans MT" w:hAnsi="Gill Sans MT"/>
+                <w:b/>
+                <w:color w:val="404040" w:themeColor="text1" w:themeTint="BF"/>
+                <w:sz w:val="16"/>
+                <w:szCs w:val="16"/>
+              </w:rPr>
+              <w:t>Teléfonos</w:t>
+            </w:r>
+          </w:p>
+          <w:p>
+            <w:pPr>
+              <w:jc w:val="right"/>
+              <w:rPr>
+                <w:rFonts w:ascii="Gill Sans MT" w:hAnsi="Gill Sans MT"/>
+                <w:color w:val="404040" w:themeColor="text1" w:themeTint="BF"/>
+                <w:sz w:val="16"/>
+                <w:szCs w:val="16"/>
+              </w:rPr>
+            </w:pPr>
+            <w:r>
+              <w:rPr>
+                <w:rFonts w:ascii="Gill Sans MT" w:hAnsi="Gill Sans MT"/>
+                <w:color w:val="404040" w:themeColor="text1" w:themeTint="BF"/>
+                <w:sz w:val="16"/>
+                <w:szCs w:val="16"/>
+              </w:rPr>
+              <w:t>01 228 814 28 91</w:t>
+            </w:r>
+          </w:p>
+          <w:p>
+            <w:pPr>
+              <w:jc w:val="right"/>
+              <w:rPr>
+                <w:rFonts w:ascii="Gill Sans MT" w:hAnsi="Gill Sans MT"/>
+                <w:color w:val="404040" w:themeColor="text1" w:themeTint="BF"/>
+                <w:sz w:val="16"/>
+                <w:szCs w:val="16"/>
+              </w:rPr>
+            </w:pPr>
+            <w:r>
+              <w:rPr>
+                <w:rFonts w:ascii="Gill Sans MT" w:hAnsi="Gill Sans MT"/>
+                <w:color w:val="404040" w:themeColor="text1" w:themeTint="BF"/>
+                <w:sz w:val="16"/>
+                <w:szCs w:val="16"/>
+              </w:rPr>
+              <w:t>01 228 842 17 00</w:t>
+            </w:r>
+          </w:p>
+          <w:p>
+            <w:pPr>
+              <w:jc w:val="right"/>
+              <w:rPr>
+                <w:rFonts w:ascii="Gill Sans MT" w:hAnsi="Gill Sans MT"/>
+                <w:color w:val="404040" w:themeColor="text1" w:themeTint="BF"/>
+                <w:sz w:val="16"/>
+                <w:szCs w:val="16"/>
+              </w:rPr>
+            </w:pPr>
+            <w:r>
+              <w:rPr>
+                <w:rFonts w:ascii="Gill Sans MT" w:hAnsi="Gill Sans MT"/>
+                <w:color w:val="404040" w:themeColor="text1" w:themeTint="BF"/>
+                <w:sz w:val="16"/>
+                <w:szCs w:val="16"/>
+              </w:rPr>
+              <w:t>Ext. 11716</w:t>
+            </w:r>
+          </w:p>
+          <w:p>
+            <w:pPr>
+              <w:jc w:val="right"/>
+              <w:rPr>
+                <w:rFonts w:ascii="Gill Sans MT" w:hAnsi="Gill Sans MT"/>
+                <w:color w:val="404040" w:themeColor="text1" w:themeTint="BF"/>
+                <w:sz w:val="16"/>
+                <w:szCs w:val="16"/>
+              </w:rPr>
+            </w:pPr>
+          </w:p>
+          <w:p>
+            <w:pPr>
+              <w:jc w:val="right"/>
+              <w:rPr>
+                <w:rFonts w:ascii="Gill Sans MT" w:hAnsi="Gill Sans MT"/>
+                <w:b/>
+                <w:color w:val="404040" w:themeColor="text1" w:themeTint="BF"/>
+                <w:sz w:val="16"/>
+                <w:szCs w:val="16"/>
+              </w:rPr>
+            </w:pPr>
+            <w:r>
+              <w:rPr>
+                <w:rFonts w:ascii="Gill Sans MT" w:hAnsi="Gill Sans MT"/>
+                <w:b/>
+                <w:color w:val="404040" w:themeColor="text1" w:themeTint="BF"/>
+                <w:sz w:val="16"/>
+                <w:szCs w:val="16"/>
+              </w:rPr>
+              <w:t>Correo electrónico</w:t>
+            </w:r>
+          </w:p>
+          <w:p>
+            <w:pPr>
+              <w:jc w:val="right"/>
+              <w:rPr>
+                <w:rFonts w:ascii="Gill Sans MT" w:hAnsi="Gill Sans MT"/>
+                <w:color w:val="404040" w:themeColor="text1" w:themeTint="BF"/>
+                <w:sz w:val="16"/>
+                <w:szCs w:val="16"/>
+              </w:rPr>
+            </w:pPr>
+            <w:r>
+              <w:rPr>
+                <w:rFonts w:ascii="Gill Sans MT" w:hAnsi="Gill Sans MT"/>
+                <w:color w:val="404040" w:themeColor="text1" w:themeTint="BF"/>
+                <w:sz w:val="16"/>
+                <w:szCs w:val="16"/>
+              </w:rPr>
+              <w:t>contraloriagral@uv.mx</w:t>
+            </w:r>
+          </w:p>
+          <w:p>
+            <w:pPr>
+              <w:jc w:val="right"/>
+              <w:rPr>
+                <w:rFonts w:ascii="Gill Sans MT" w:hAnsi="Gill Sans MT"/>
+                <w:color w:val="404040" w:themeColor="text1" w:themeTint="BF"/>
+                <w:sz w:val="16"/>
+                <w:szCs w:val="16"/>
+              </w:rPr>
+            </w:pPr>
+          </w:p>
+          <w:p>
+            <w:pPr>
+              <w:jc w:val="right"/>
+              <w:rPr>
+                <w:rFonts w:ascii="Gill Sans MT" w:hAnsi="Gill Sans MT"/>
+                <w:color w:val="404040" w:themeColor="text1" w:themeTint="BF"/>
+                <w:sz w:val="16"/>
                 <w:szCs w:val="14"/>
               </w:rPr>
             </w:pPr>
@@ -454,286 +859,18 @@
                 <w:rFonts w:ascii="Gill Sans MT" w:hAnsi="Gill Sans MT"/>
                 <w:color w:val="404040" w:themeColor="text1" w:themeTint="BF"/>
                 <w:sz w:val="16"/>
+                <w:szCs w:val="16"/>
+              </w:rPr>
+              <w:t>www.uv.mx/contraloria</w:t>
+            </w:r>
+            <w:r>
+              <w:rPr>
+                <w:rFonts w:ascii="Gill Sans MT" w:hAnsi="Gill Sans MT"/>
+                <w:color w:val="404040" w:themeColor="text1" w:themeTint="BF"/>
+                <w:sz w:val="16"/>
                 <w:szCs w:val="14"/>
               </w:rPr>
-              <w:t>Murillo Vidal Núm. 250</w:t>
-            </w:r>
-          </w:p>
-          <w:p>
-            <w:pPr>
-              <w:jc w:val="right"/>
-              <w:rPr>
-                <w:rFonts w:ascii="Gill Sans MT" w:hAnsi="Gill Sans MT"/>
-                <w:color w:val="404040" w:themeColor="text1" w:themeTint="BF"/>
-                <w:sz w:val="16"/>
-                <w:szCs w:val="14"/>
-              </w:rPr>
-            </w:pPr>
-            <w:r>
-              <w:rPr>
-                <w:rFonts w:ascii="Gill Sans MT" w:hAnsi="Gill Sans MT"/>
-                <w:color w:val="404040" w:themeColor="text1" w:themeTint="BF"/>
-                <w:sz w:val="16"/>
-                <w:szCs w:val="14"/>
-              </w:rPr>
-              <w:t>Col. Cuauhtémoc</w:t>
-            </w:r>
-          </w:p>
-          <w:p>
-            <w:pPr>
-              <w:jc w:val="right"/>
-              <w:rPr>
-                <w:rFonts w:ascii="Gill Sans MT" w:hAnsi="Gill Sans MT"/>
-                <w:color w:val="404040" w:themeColor="text1" w:themeTint="BF"/>
-                <w:sz w:val="16"/>
-                <w:szCs w:val="14"/>
-              </w:rPr>
-            </w:pPr>
-            <w:r>
-              <w:rPr>
-                <w:rFonts w:ascii="Gill Sans MT" w:hAnsi="Gill Sans MT"/>
-                <w:color w:val="404040" w:themeColor="text1" w:themeTint="BF"/>
-                <w:sz w:val="16"/>
-                <w:szCs w:val="14"/>
-              </w:rPr>
-              <w:t>{</w:t>
-            </w:r>
-            <w:proofErr w:type="spellStart"/>
-            <w:r>
-              <w:rPr>
-                <w:rFonts w:ascii="Gill Sans MT" w:hAnsi="Gill Sans MT"/>
-                <w:color w:val="404040" w:themeColor="text1" w:themeTint="BF"/>
-                <w:sz w:val="16"/>
-                <w:szCs w:val="14"/>
-              </w:rPr>
-              <w:t>abreviacion</w:t>
-            </w:r>
-            <w:proofErr w:type="spellEnd"/>
-            <w:r>
-              <w:rPr>
-                <w:rFonts w:ascii="Gill Sans MT" w:hAnsi="Gill Sans MT"/>
-                <w:color w:val="404040" w:themeColor="text1" w:themeTint="BF"/>
-                <w:sz w:val="16"/>
-                <w:szCs w:val="14"/>
-              </w:rPr>
-              <w:t>} 91069</w:t>
-            </w:r>
-          </w:p>
-          <w:p>
-            <w:pPr>
-              <w:jc w:val="right"/>
-              <w:rPr>
-                <w:rFonts w:ascii="Gill Sans MT" w:hAnsi="Gill Sans MT"/>
-                <w:color w:val="404040" w:themeColor="text1" w:themeTint="BF"/>
-                <w:sz w:val="16"/>
-                <w:szCs w:val="14"/>
-              </w:rPr>
-            </w:pPr>
-            <w:r>
-              <w:rPr>
-                <w:rFonts w:ascii="Gill Sans MT" w:hAnsi="Gill Sans MT"/>
-                <w:color w:val="404040" w:themeColor="text1" w:themeTint="BF"/>
-                <w:sz w:val="16"/>
-                <w:szCs w:val="14"/>
-              </w:rPr>
-              <w:t>Xalapa, Ver.</w:t>
-            </w:r>
-          </w:p>
-          <w:p>
-            <w:pPr>
-              <w:jc w:val="right"/>
-              <w:rPr>
-                <w:rFonts w:ascii="Gill Sans MT" w:hAnsi="Gill Sans MT"/>
-                <w:color w:val="404040" w:themeColor="text1" w:themeTint="BF"/>
-                <w:sz w:val="16"/>
-                <w:szCs w:val="14"/>
-              </w:rPr>
-            </w:pPr>
-            <w:r>
-              <w:rPr>
-                <w:rFonts w:ascii="Gill Sans MT" w:hAnsi="Gill Sans MT"/>
-                <w:color w:val="404040" w:themeColor="text1" w:themeTint="BF"/>
-                <w:sz w:val="16"/>
-                <w:szCs w:val="14"/>
-              </w:rPr>
-              <w:t>México</w:t>
-            </w:r>
-          </w:p>
-          <w:p>
-            <w:pPr>
-              <w:jc w:val="right"/>
-              <w:rPr>
-                <w:rFonts w:ascii="Gill Sans MT" w:hAnsi="Gill Sans MT"/>
-                <w:color w:val="404040" w:themeColor="text1" w:themeTint="BF"/>
-                <w:sz w:val="16"/>
-                <w:szCs w:val="14"/>
-              </w:rPr>
-            </w:pPr>
-          </w:p>
-          <w:p>
-            <w:pPr>
-              <w:jc w:val="right"/>
-              <w:rPr>
-                <w:rFonts w:ascii="Gill Sans MT" w:hAnsi="Gill Sans MT"/>
-                <w:b/>
-                <w:color w:val="404040" w:themeColor="text1" w:themeTint="BF"/>
-                <w:sz w:val="16"/>
-                <w:szCs w:val="14"/>
-              </w:rPr>
-            </w:pPr>
-            <w:r>
-              <w:rPr>
-                <w:rFonts w:ascii="Gill Sans MT" w:hAnsi="Gill Sans MT"/>
-                <w:b/>
-                <w:color w:val="404040" w:themeColor="text1" w:themeTint="BF"/>
-                <w:sz w:val="16"/>
-                <w:szCs w:val="14"/>
-              </w:rPr>
-              <w:t>Teléfonos</w:t>
-            </w:r>
-          </w:p>
-          <w:p>
-            <w:pPr>
-              <w:jc w:val="right"/>
-              <w:rPr>
-                <w:rFonts w:ascii="Gill Sans MT" w:hAnsi="Gill Sans MT"/>
-                <w:color w:val="404040" w:themeColor="text1" w:themeTint="BF"/>
-                <w:sz w:val="16"/>
-                <w:szCs w:val="14"/>
-              </w:rPr>
-            </w:pPr>
-            <w:r>
-              <w:rPr>
-                <w:rFonts w:ascii="Gill Sans MT" w:hAnsi="Gill Sans MT"/>
-                <w:color w:val="404040" w:themeColor="text1" w:themeTint="BF"/>
-                <w:sz w:val="16"/>
-                <w:szCs w:val="14"/>
-              </w:rPr>
-              <w:t>01 228 814 28 91</w:t>
-            </w:r>
-          </w:p>
-          <w:p>
-            <w:pPr>
-              <w:jc w:val="right"/>
-              <w:rPr>
-                <w:rFonts w:ascii="Gill Sans MT" w:hAnsi="Gill Sans MT"/>
-                <w:color w:val="404040" w:themeColor="text1" w:themeTint="BF"/>
-                <w:sz w:val="16"/>
-                <w:szCs w:val="14"/>
-              </w:rPr>
-            </w:pPr>
-            <w:r>
-              <w:rPr>
-                <w:rFonts w:ascii="Gill Sans MT" w:hAnsi="Gill Sans MT"/>
-                <w:color w:val="404040" w:themeColor="text1" w:themeTint="BF"/>
-                <w:sz w:val="16"/>
-                <w:szCs w:val="14"/>
-              </w:rPr>
-              <w:t>01 228 842 17 00</w:t>
-            </w:r>
-          </w:p>
-          <w:p>
-            <w:pPr>
-              <w:jc w:val="right"/>
-              <w:rPr>
-                <w:rFonts w:ascii="Gill Sans MT" w:hAnsi="Gill Sans MT"/>
-                <w:color w:val="404040" w:themeColor="text1" w:themeTint="BF"/>
-                <w:sz w:val="16"/>
-                <w:szCs w:val="14"/>
-              </w:rPr>
-            </w:pPr>
-            <w:r>
-              <w:rPr>
-                <w:rFonts w:ascii="Gill Sans MT" w:hAnsi="Gill Sans MT"/>
-                <w:color w:val="404040" w:themeColor="text1" w:themeTint="BF"/>
-                <w:sz w:val="16"/>
-                <w:szCs w:val="14"/>
-              </w:rPr>
-              <w:t>Ext. 11716</w:t>
-            </w:r>
-          </w:p>
-          <w:p>
-            <w:pPr>
-              <w:jc w:val="right"/>
-              <w:rPr>
-                <w:rFonts w:ascii="Gill Sans MT" w:hAnsi="Gill Sans MT"/>
-                <w:color w:val="404040" w:themeColor="text1" w:themeTint="BF"/>
-                <w:sz w:val="16"/>
-                <w:szCs w:val="14"/>
-              </w:rPr>
-            </w:pPr>
-          </w:p>
-          <w:p>
-            <w:pPr>
-              <w:jc w:val="right"/>
-              <w:rPr>
-                <w:rFonts w:ascii="Gill Sans MT" w:hAnsi="Gill Sans MT"/>
-                <w:b/>
-                <w:color w:val="404040" w:themeColor="text1" w:themeTint="BF"/>
-                <w:sz w:val="16"/>
-                <w:szCs w:val="14"/>
-              </w:rPr>
-            </w:pPr>
-            <w:r>
-              <w:rPr>
-                <w:rFonts w:ascii="Gill Sans MT" w:hAnsi="Gill Sans MT"/>
-                <w:b/>
-                <w:color w:val="404040" w:themeColor="text1" w:themeTint="BF"/>
-                <w:sz w:val="16"/>
-                <w:szCs w:val="14"/>
-              </w:rPr>
-              <w:t>Correo electrónico</w:t>
-            </w:r>
-          </w:p>
-          <w:p>
-            <w:pPr>
-              <w:jc w:val="right"/>
-              <w:rPr>
-                <w:rFonts w:ascii="Gill Sans MT" w:hAnsi="Gill Sans MT"/>
-                <w:color w:val="404040" w:themeColor="text1" w:themeTint="BF"/>
-                <w:sz w:val="16"/>
-                <w:szCs w:val="14"/>
-              </w:rPr>
-            </w:pPr>
-            <w:r>
-              <w:rPr>
-                <w:rFonts w:ascii="Gill Sans MT" w:hAnsi="Gill Sans MT"/>
-                <w:color w:val="404040" w:themeColor="text1" w:themeTint="BF"/>
-                <w:sz w:val="16"/>
-                <w:szCs w:val="14"/>
-              </w:rPr>
-              <w:t>contraloriagral@uv.mx</w:t>
-            </w:r>
-          </w:p>
-          <w:p>
-            <w:pPr>
-              <w:jc w:val="right"/>
-              <w:rPr>
-                <w:rFonts w:ascii="Gill Sans MT" w:hAnsi="Gill Sans MT"/>
-                <w:color w:val="404040" w:themeColor="text1" w:themeTint="BF"/>
-                <w:sz w:val="16"/>
-                <w:szCs w:val="14"/>
-              </w:rPr>
-            </w:pPr>
-          </w:p>
-          <w:p>
-            <w:pPr>
-              <w:jc w:val="right"/>
-              <w:rPr>
-                <w:rFonts w:ascii="Gill Sans MT" w:hAnsi="Gill Sans MT"/>
-                <w:color w:val="404040" w:themeColor="text1" w:themeTint="BF"/>
-                <w:sz w:val="16"/>
-                <w:szCs w:val="14"/>
-              </w:rPr>
-            </w:pPr>
-            <w:r>
-              <w:rPr>
-                <w:rFonts w:ascii="Gill Sans MT" w:hAnsi="Gill Sans MT"/>
-                <w:color w:val="404040" w:themeColor="text1" w:themeTint="BF"/>
-                <w:sz w:val="16"/>
-                <w:szCs w:val="14"/>
-              </w:rPr>
-              <w:t>www.uv.mx/contraloria/</w:t>
+              <w:t>/</w:t>
             </w:r>
           </w:p>
           <w:p/>
@@ -751,8 +888,8 @@
           <w:p>
             <w:pPr>
               <w:rPr>
-                <w:sz w:val="22"/>
-                <w:szCs w:val="22"/>
+                <w:sz w:val="24"/>
+                <w:szCs w:val="24"/>
               </w:rPr>
             </w:pPr>
             <w:r>
@@ -760,8 +897,8 @@
                 <w:rFonts w:ascii="Gill Sans MT" w:hAnsi="Gill Sans MT"/>
                 <w:b/>
                 <w:bCs/>
-                <w:sz w:val="22"/>
-                <w:szCs w:val="22"/>
+                <w:sz w:val="24"/>
+                <w:szCs w:val="24"/>
               </w:rPr>
               <w:t>{</w:t>
             </w:r>
@@ -771,8 +908,8 @@
                 <w:rFonts w:ascii="Gill Sans MT" w:hAnsi="Gill Sans MT"/>
                 <w:b/>
                 <w:bCs/>
-                <w:sz w:val="22"/>
-                <w:szCs w:val="22"/>
+                <w:sz w:val="24"/>
+                <w:szCs w:val="24"/>
               </w:rPr>
               <w:t>abreviacion</w:t>
             </w:r>
@@ -782,8 +919,8 @@
                 <w:rFonts w:ascii="Gill Sans MT" w:hAnsi="Gill Sans MT"/>
                 <w:b/>
                 <w:bCs/>
-                <w:sz w:val="22"/>
-                <w:szCs w:val="22"/>
+                <w:sz w:val="24"/>
+                <w:szCs w:val="24"/>
               </w:rPr>
               <w:t>} {nombre} {</w:t>
             </w:r>
@@ -793,8 +930,8 @@
                 <w:rFonts w:ascii="Gill Sans MT" w:hAnsi="Gill Sans MT"/>
                 <w:b/>
                 <w:bCs/>
-                <w:sz w:val="22"/>
-                <w:szCs w:val="22"/>
+                <w:sz w:val="24"/>
+                <w:szCs w:val="24"/>
               </w:rPr>
               <w:t>apellidoPaterno</w:t>
             </w:r>
@@ -804,8 +941,8 @@
                 <w:rFonts w:ascii="Gill Sans MT" w:hAnsi="Gill Sans MT"/>
                 <w:b/>
                 <w:bCs/>
-                <w:sz w:val="22"/>
-                <w:szCs w:val="22"/>
+                <w:sz w:val="24"/>
+                <w:szCs w:val="24"/>
               </w:rPr>
               <w:t>} {</w:t>
             </w:r>
@@ -815,8 +952,8 @@
                 <w:rFonts w:ascii="Gill Sans MT" w:hAnsi="Gill Sans MT"/>
                 <w:b/>
                 <w:bCs/>
-                <w:sz w:val="22"/>
-                <w:szCs w:val="22"/>
+                <w:sz w:val="24"/>
+                <w:szCs w:val="24"/>
               </w:rPr>
               <w:t>apellidoMaterno</w:t>
             </w:r>
@@ -826,39 +963,39 @@
                 <w:rFonts w:ascii="Gill Sans MT" w:hAnsi="Gill Sans MT"/>
                 <w:b/>
                 <w:bCs/>
-                <w:sz w:val="22"/>
-                <w:szCs w:val="22"/>
+                <w:sz w:val="24"/>
+                <w:szCs w:val="24"/>
               </w:rPr>
               <w:t>}</w:t>
             </w:r>
             <w:r>
               <w:rPr>
                 <w:rFonts w:ascii="Gill Sans MT" w:hAnsi="Gill Sans MT"/>
-                <w:sz w:val="22"/>
-                <w:szCs w:val="22"/>
+                <w:sz w:val="24"/>
+                <w:szCs w:val="24"/>
               </w:rPr>
               <w:br/>
               <w:t xml:space="preserve"> {puesto}</w:t>
             </w:r>
             <w:r>
               <w:rPr>
-                <w:sz w:val="22"/>
-                <w:szCs w:val="22"/>
+                <w:sz w:val="24"/>
+                <w:szCs w:val="24"/>
               </w:rPr>
               <w:br/>
             </w:r>
             <w:r>
               <w:rPr>
                 <w:rFonts w:ascii="Gill Sans MT" w:hAnsi="Gill Sans MT"/>
-                <w:sz w:val="22"/>
-                <w:szCs w:val="22"/>
+                <w:sz w:val="24"/>
+                <w:szCs w:val="24"/>
               </w:rPr>
               <w:t xml:space="preserve"> Contraloría General de la Universidad Veracruzana</w:t>
             </w:r>
             <w:r>
               <w:rPr>
-                <w:sz w:val="22"/>
-                <w:szCs w:val="22"/>
+                <w:sz w:val="24"/>
+                <w:szCs w:val="24"/>
               </w:rPr>
               <w:br/>
               <w:t xml:space="preserve"> </w:t>
@@ -866,8 +1003,8 @@
             <w:r>
               <w:rPr>
                 <w:rFonts w:ascii="Gill Sans MT" w:hAnsi="Gill Sans MT"/>
-                <w:sz w:val="22"/>
-                <w:szCs w:val="22"/>
+                <w:sz w:val="24"/>
+                <w:szCs w:val="24"/>
               </w:rPr>
               <w:t>P r e s e n t e.</w:t>
             </w:r>
@@ -877,8 +1014,8 @@
               <w:spacing w:before="200" w:after="200"/>
               <w:rPr>
                 <w:rFonts w:ascii="Gill Sans MT" w:hAnsi="Gill Sans MT"/>
-                <w:sz w:val="22"/>
-                <w:szCs w:val="22"/>
+                <w:sz w:val="24"/>
+                <w:szCs w:val="24"/>
               </w:rPr>
             </w:pPr>
             <w:r>
@@ -886,8 +1023,8 @@
                 <w:rFonts w:ascii="Gill Sans MT" w:hAnsi="Gill Sans MT"/>
                 <w:i/>
                 <w:iCs/>
-                <w:sz w:val="22"/>
-                <w:szCs w:val="22"/>
+                <w:sz w:val="24"/>
+                <w:szCs w:val="24"/>
               </w:rPr>
               <w:t>Apreciable {</w:t>
             </w:r>
@@ -897,63 +1034,73 @@
                 <w:rFonts w:ascii="Gill Sans MT" w:hAnsi="Gill Sans MT"/>
                 <w:i/>
                 <w:iCs/>
-                <w:sz w:val="22"/>
-                <w:szCs w:val="22"/>
-              </w:rPr>
-              <w:t>ocupacion</w:t>
-            </w:r>
-            <w:proofErr w:type="spellEnd"/>
+                <w:sz w:val="24"/>
+                <w:szCs w:val="24"/>
+              </w:rPr>
+              <w:t>abreviacionO</w:t>
+            </w:r>
             <w:r>
               <w:rPr>
                 <w:rFonts w:ascii="Gill Sans MT" w:hAnsi="Gill Sans MT"/>
                 <w:i/>
                 <w:iCs/>
-                <w:sz w:val="22"/>
-                <w:szCs w:val="22"/>
-              </w:rPr>
-              <w:t>} {</w:t>
-            </w:r>
-            <w:proofErr w:type="spellStart"/>
+                <w:sz w:val="24"/>
+                <w:szCs w:val="24"/>
+              </w:rPr>
+              <w:t>cupacion</w:t>
+            </w:r>
+            <w:proofErr w:type="spellEnd"/>
             <w:r>
               <w:rPr>
                 <w:rFonts w:ascii="Gill Sans MT" w:hAnsi="Gill Sans MT"/>
                 <w:i/>
                 <w:iCs/>
-                <w:sz w:val="22"/>
-                <w:szCs w:val="22"/>
-              </w:rPr>
-              <w:t>apellidoPaterno</w:t>
-            </w:r>
-            <w:proofErr w:type="spellEnd"/>
+                <w:sz w:val="24"/>
+                <w:szCs w:val="24"/>
+              </w:rPr>
+              <w:t>} {</w:t>
+            </w:r>
+            <w:proofErr w:type="spellStart"/>
             <w:r>
               <w:rPr>
                 <w:rFonts w:ascii="Gill Sans MT" w:hAnsi="Gill Sans MT"/>
                 <w:i/>
                 <w:iCs/>
-                <w:sz w:val="22"/>
-                <w:szCs w:val="22"/>
-              </w:rPr>
-              <w:t>} {</w:t>
-            </w:r>
-            <w:proofErr w:type="spellStart"/>
+                <w:sz w:val="24"/>
+                <w:szCs w:val="24"/>
+              </w:rPr>
+              <w:t>apellidoPaterno</w:t>
+            </w:r>
+            <w:proofErr w:type="spellEnd"/>
             <w:r>
               <w:rPr>
                 <w:rFonts w:ascii="Gill Sans MT" w:hAnsi="Gill Sans MT"/>
                 <w:i/>
                 <w:iCs/>
-                <w:sz w:val="22"/>
-                <w:szCs w:val="22"/>
-              </w:rPr>
-              <w:t>apellidoMaterno</w:t>
-            </w:r>
-            <w:proofErr w:type="spellEnd"/>
+                <w:sz w:val="24"/>
+                <w:szCs w:val="24"/>
+              </w:rPr>
+              <w:t>} {</w:t>
+            </w:r>
+            <w:proofErr w:type="spellStart"/>
             <w:r>
               <w:rPr>
                 <w:rFonts w:ascii="Gill Sans MT" w:hAnsi="Gill Sans MT"/>
                 <w:i/>
                 <w:iCs/>
-                <w:sz w:val="22"/>
-                <w:szCs w:val="22"/>
+                <w:sz w:val="24"/>
+                <w:szCs w:val="24"/>
+              </w:rPr>
+              <w:t>apellidoMaterno</w:t>
+            </w:r>
+            <w:proofErr w:type="spellEnd"/>
+            <w:r>
+              <w:rPr>
+                <w:rFonts w:ascii="Gill Sans MT" w:hAnsi="Gill Sans MT"/>
+                <w:i/>
+                <w:iCs/>
+                <w:sz w:val="24"/>
+                <w:szCs w:val="24"/>
               </w:rPr>
               <w:t>},</w:t>
             </w:r>
@@ -963,14 +1110,14 @@
               <w:spacing w:after="200"/>
               <w:jc w:val="both"/>
               <w:rPr>
-                <w:sz w:val="22"/>
-                <w:szCs w:val="22"/>
-              </w:rPr>
-            </w:pPr>
-            <w:r>
-              <w:rPr>
-                <w:sz w:val="22"/>
-                <w:szCs w:val="22"/>
+                <w:sz w:val="24"/>
+                <w:szCs w:val="24"/>
+              </w:rPr>
+            </w:pPr>
+            <w:r>
+              <w:rPr>
+                <w:sz w:val="24"/>
+                <w:szCs w:val="24"/>
               </w:rPr>
               <w:t xml:space="preserve">Con fundamento en lo dispuesto por los artículos 34-B, y 34-C, fracción XI, de la Ley Orgánica de la Universidad Veracruzana; 4, fracción X, 14, 15, y 17, fracciones IV y XIV, 336, fracción XXIII, del Estatuto General de la Universidad Veracruzana; y en atención al </w:t>
             </w:r>
@@ -978,63 +1125,63 @@
               <w:rPr>
                 <w:i/>
                 <w:iCs/>
-                <w:sz w:val="22"/>
-                <w:szCs w:val="22"/>
+                <w:sz w:val="24"/>
+                <w:szCs w:val="24"/>
               </w:rPr>
               <w:t>“Acuerdo mediante el cual se instruye a las áreas de la Contraloría General para atender las solicitudes de acceso a la información, dentro del ámbito de su competencia”</w:t>
             </w:r>
             <w:r>
               <w:rPr>
-                <w:sz w:val="22"/>
-                <w:szCs w:val="22"/>
+                <w:sz w:val="24"/>
+                <w:szCs w:val="24"/>
               </w:rPr>
               <w:t>, de fecha {</w:t>
             </w:r>
             <w:proofErr w:type="spellStart"/>
             <w:r>
               <w:rPr>
-                <w:sz w:val="22"/>
-                <w:szCs w:val="22"/>
+                <w:sz w:val="24"/>
+                <w:szCs w:val="24"/>
               </w:rPr>
               <w:t>fechaReferencia</w:t>
             </w:r>
             <w:proofErr w:type="spellEnd"/>
             <w:r>
               <w:rPr>
-                <w:sz w:val="22"/>
-                <w:szCs w:val="22"/>
+                <w:sz w:val="24"/>
+                <w:szCs w:val="24"/>
               </w:rPr>
               <w:t>}, me permito remitir a usted la solicitud de información recibida el {</w:t>
             </w:r>
             <w:proofErr w:type="spellStart"/>
             <w:r>
               <w:rPr>
-                <w:sz w:val="22"/>
-                <w:szCs w:val="22"/>
+                <w:sz w:val="24"/>
+                <w:szCs w:val="24"/>
               </w:rPr>
               <w:t>fechaHoyLong</w:t>
             </w:r>
             <w:proofErr w:type="spellEnd"/>
             <w:r>
               <w:rPr>
-                <w:sz w:val="22"/>
-                <w:szCs w:val="22"/>
+                <w:sz w:val="24"/>
+                <w:szCs w:val="24"/>
               </w:rPr>
               <w:t>}, a través de la Plataforma Nacional de Transparencia, registrada con el número de folio {folio}, que se adjunta, la cual tiene como fecha de vencimiento para su atención el día {</w:t>
             </w:r>
             <w:proofErr w:type="spellStart"/>
             <w:r>
               <w:rPr>
-                <w:sz w:val="22"/>
-                <w:szCs w:val="22"/>
+                <w:sz w:val="24"/>
+                <w:szCs w:val="24"/>
               </w:rPr>
               <w:t>fechaMaxima</w:t>
             </w:r>
             <w:proofErr w:type="spellEnd"/>
             <w:r>
               <w:rPr>
-                <w:sz w:val="22"/>
-                <w:szCs w:val="22"/>
+                <w:sz w:val="24"/>
+                <w:szCs w:val="24"/>
               </w:rPr>
               <w:t>}.</w:t>
             </w:r>
@@ -1044,14 +1191,14 @@
               <w:spacing w:after="200"/>
               <w:jc w:val="both"/>
               <w:rPr>
-                <w:sz w:val="22"/>
-                <w:szCs w:val="22"/>
-              </w:rPr>
-            </w:pPr>
-            <w:r>
-              <w:rPr>
-                <w:sz w:val="22"/>
-                <w:szCs w:val="22"/>
+                <w:sz w:val="24"/>
+                <w:szCs w:val="24"/>
+              </w:rPr>
+            </w:pPr>
+            <w:r>
+              <w:rPr>
+                <w:sz w:val="24"/>
+                <w:szCs w:val="24"/>
               </w:rPr>
               <w:t>Lo anterior, con la finalidad de que, en el ámbito de su competencia, se lleve a cabo el análisis respectivo y se otorgue la respuesta que corresponda, conforme a los plazos establecidos en el artículo 116 de la Ley Número 250 de Transparencia y Acceso a la Información Pública del Estado de Veracruz de Ignacio de la Llave, a través de los medios establecidos por la Coordinación Universitaria de Transparencia, Acceso a la Información y Protección de Datos Personales (CUTAI).</w:t>
             </w:r>
@@ -1061,14 +1208,14 @@
               <w:spacing w:after="400"/>
               <w:jc w:val="both"/>
               <w:rPr>
-                <w:sz w:val="22"/>
-                <w:szCs w:val="22"/>
-              </w:rPr>
-            </w:pPr>
-            <w:r>
-              <w:rPr>
-                <w:sz w:val="22"/>
-                <w:szCs w:val="22"/>
+                <w:sz w:val="24"/>
+                <w:szCs w:val="24"/>
+              </w:rPr>
+            </w:pPr>
+            <w:r>
+              <w:rPr>
+                <w:sz w:val="24"/>
+                <w:szCs w:val="24"/>
               </w:rPr>
               <w:t>Sin otro particular, hago propicia la ocasión para enviarle un cordial saludo.</w:t>
             </w:r>
@@ -1078,8 +1225,8 @@
               <w:jc w:val="center"/>
               <w:rPr>
                 <w:rFonts w:ascii="Gill Sans MT" w:hAnsi="Gill Sans MT"/>
-                <w:sz w:val="22"/>
-                <w:szCs w:val="22"/>
+                <w:sz w:val="24"/>
+                <w:szCs w:val="24"/>
               </w:rPr>
             </w:pPr>
             <w:r>
@@ -1087,16 +1234,16 @@
                 <w:rFonts w:ascii="Gill Sans MT" w:hAnsi="Gill Sans MT"/>
                 <w:b/>
                 <w:bCs/>
-                <w:sz w:val="22"/>
-                <w:szCs w:val="22"/>
+                <w:sz w:val="24"/>
+                <w:szCs w:val="24"/>
               </w:rPr>
               <w:t>A T E N T A M E N T E.</w:t>
             </w:r>
             <w:r>
               <w:rPr>
                 <w:rFonts w:ascii="Gill Sans MT" w:hAnsi="Gill Sans MT"/>
-                <w:sz w:val="22"/>
-                <w:szCs w:val="22"/>
+                <w:sz w:val="24"/>
+                <w:szCs w:val="24"/>
               </w:rPr>
               <w:br/>
               <w:t xml:space="preserve"> “Lis de Veracruz: Arte, Ciencia, Luz”</w:t>
@@ -1104,8 +1251,8 @@
             <w:r>
               <w:rPr>
                 <w:rFonts w:ascii="Gill Sans MT" w:hAnsi="Gill Sans MT"/>
-                <w:sz w:val="22"/>
-                <w:szCs w:val="22"/>
+                <w:sz w:val="24"/>
+                <w:szCs w:val="24"/>
               </w:rPr>
               <w:br/>
               <w:t xml:space="preserve"> Xalapa, Ver., a {</w:t>
@@ -1114,8 +1261,8 @@
             <w:r>
               <w:rPr>
                 <w:rFonts w:ascii="Gill Sans MT" w:hAnsi="Gill Sans MT"/>
-                <w:sz w:val="22"/>
-                <w:szCs w:val="22"/>
+                <w:sz w:val="24"/>
+                <w:szCs w:val="24"/>
               </w:rPr>
               <w:t>fechaHoyLong</w:t>
             </w:r>
@@ -1123,8 +1270,8 @@
             <w:r>
               <w:rPr>
                 <w:rFonts w:ascii="Gill Sans MT" w:hAnsi="Gill Sans MT"/>
-                <w:sz w:val="22"/>
-                <w:szCs w:val="22"/>
+                <w:sz w:val="24"/>
+                <w:szCs w:val="24"/>
               </w:rPr>
               <w:t>}</w:t>
             </w:r>
@@ -1135,8 +1282,8 @@
               <w:jc w:val="center"/>
               <w:rPr>
                 <w:rFonts w:ascii="Gill Sans MT" w:hAnsi="Gill Sans MT"/>
-                <w:sz w:val="22"/>
-                <w:szCs w:val="22"/>
+                <w:sz w:val="24"/>
+                <w:szCs w:val="24"/>
               </w:rPr>
             </w:pPr>
             <w:r>
@@ -1144,16 +1291,16 @@
                 <w:rFonts w:ascii="Gill Sans MT" w:hAnsi="Gill Sans MT"/>
                 <w:b/>
                 <w:bCs/>
-                <w:sz w:val="22"/>
-                <w:szCs w:val="22"/>
+                <w:sz w:val="24"/>
+                <w:szCs w:val="24"/>
               </w:rPr>
               <w:t>M.A.P. Norma Hilda Jiménez Martínez</w:t>
             </w:r>
             <w:r>
               <w:rPr>
                 <w:rFonts w:ascii="Gill Sans MT" w:hAnsi="Gill Sans MT"/>
-                <w:sz w:val="22"/>
-                <w:szCs w:val="22"/>
+                <w:sz w:val="24"/>
+                <w:szCs w:val="24"/>
               </w:rPr>
               <w:br/>
               <w:t xml:space="preserve"> Contralora General</w:t>
@@ -1164,14 +1311,16 @@
               <w:spacing w:before="400"/>
               <w:rPr>
                 <w:rFonts w:ascii="Gill Sans MT" w:hAnsi="Gill Sans MT"/>
+                <w:sz w:val="16"/>
+                <w:szCs w:val="16"/>
               </w:rPr>
             </w:pPr>
             <w:proofErr w:type="spellStart"/>
             <w:r>
               <w:rPr>
                 <w:rFonts w:ascii="Gill Sans MT" w:hAnsi="Gill Sans MT"/>
-                <w:sz w:val="14"/>
-                <w:szCs w:val="14"/>
+                <w:sz w:val="16"/>
+                <w:szCs w:val="16"/>
               </w:rPr>
               <w:t>C.c.p</w:t>
             </w:r>
@@ -1179,8 +1328,8 @@
             <w:r>
               <w:rPr>
                 <w:rFonts w:ascii="Gill Sans MT" w:hAnsi="Gill Sans MT"/>
-                <w:sz w:val="14"/>
-                <w:szCs w:val="14"/>
+                <w:sz w:val="16"/>
+                <w:szCs w:val="16"/>
               </w:rPr>
               <w:t>. Archivo. Elaboró: RLDG</w:t>
             </w:r>

</xml_diff>